<commit_message>
Match resume PDF to the official serif layout
Rebuild the generator so Youness-Jellouli.pdf uses the same design as the uploaded CV: centered name, icon contact row, underlined French section titles, company left / dates right, blue project links, and a one-page serif template.

Co-authored-by: JellYouness <JellYouness@users.noreply.github.com>
</commit_message>
<xml_diff>
--- a/resume/output/Youness-Jellouli.docx
+++ b/resume/output/Youness-Jellouli.docx
@@ -4,469 +4,1170 @@
   <w:body>
     <w:p>
       <w:pPr>
-        <w:spacing w:before="0" w:after="0" w:line="240" w:lineRule="auto"/>
+        <w:spacing w:before="0" w:after="80" w:line="240" w:lineRule="auto"/>
         <w:jc w:val="center"/>
       </w:pPr>
       <w:r>
         <w:rPr>
-          <w:rFonts w:ascii="Calibri" w:hAnsi="Calibri" w:eastAsia="Calibri"/>
+          <w:rFonts w:ascii="Times New Roman" w:hAnsi="Times New Roman" w:eastAsia="Times New Roman"/>
           <w:b/>
-          <w:color w:val="111111"/>
-          <w:sz w:val="40"/>
+          <w:i w:val="0"/>
+          <w:color w:val="2E3D50"/>
+          <w:sz w:val="44"/>
         </w:rPr>
         <w:t>Youness JELLOULI</w:t>
       </w:r>
     </w:p>
     <w:p>
       <w:pPr>
-        <w:spacing w:before="40" w:after="40" w:line="240" w:lineRule="auto"/>
+        <w:spacing w:before="0" w:after="160" w:line="240" w:lineRule="auto"/>
         <w:jc w:val="center"/>
       </w:pPr>
       <w:r>
         <w:rPr>
-          <w:rFonts w:ascii="Calibri" w:hAnsi="Calibri" w:eastAsia="Calibri"/>
+          <w:rFonts w:ascii="Times New Roman" w:hAnsi="Times New Roman" w:eastAsia="Times New Roman"/>
           <w:b w:val="0"/>
-          <w:color w:val="333333"/>
-          <w:sz w:val="22"/>
+          <w:i w:val="0"/>
+          <w:color w:val="2E3D50"/>
+          <w:sz w:val="18"/>
         </w:rPr>
-        <w:t>Full Stack Developer | Next.js · React · Node.js · Laravel</w:t>
+        <w:t>Casablanca, Morocco</w:t>
+      </w:r>
+      <w:r>
+        <w:rPr>
+          <w:rFonts w:ascii="Times New Roman" w:hAnsi="Times New Roman" w:eastAsia="Times New Roman"/>
+          <w:b w:val="0"/>
+          <w:i w:val="0"/>
+          <w:color w:val="2E3D50"/>
+          <w:sz w:val="18"/>
+        </w:rPr>
+        <w:t xml:space="preserve">   </w:t>
+      </w:r>
+      <w:hyperlink r:id="rId9">
+        <w:r>
+          <w:rPr>
+            <w:color w:val="2B7FFF"/>
+            <w:u w:val="single"/>
+            <w:sz w:val="18"/>
+            <w:szCs w:val="18"/>
+            <w:rFonts w:ascii="Times New Roman" w:hAnsi="Times New Roman"/>
+          </w:rPr>
+          <w:t xml:space="preserve">younessjellouli12@gmail.com</w:t>
+        </w:r>
+      </w:hyperlink>
+      <w:r>
+        <w:rPr>
+          <w:rFonts w:ascii="Times New Roman" w:hAnsi="Times New Roman" w:eastAsia="Times New Roman"/>
+          <w:b w:val="0"/>
+          <w:i w:val="0"/>
+          <w:color w:val="2E3D50"/>
+          <w:sz w:val="18"/>
+        </w:rPr>
+        <w:t xml:space="preserve">   </w:t>
+      </w:r>
+      <w:hyperlink r:id="rId10">
+        <w:r>
+          <w:rPr>
+            <w:color w:val="2B7FFF"/>
+            <w:u w:val="single"/>
+            <w:sz w:val="18"/>
+            <w:szCs w:val="18"/>
+            <w:rFonts w:ascii="Times New Roman" w:hAnsi="Times New Roman"/>
+          </w:rPr>
+          <w:t xml:space="preserve">(+212)627-594239</w:t>
+        </w:r>
+      </w:hyperlink>
+      <w:r>
+        <w:rPr>
+          <w:rFonts w:ascii="Times New Roman" w:hAnsi="Times New Roman" w:eastAsia="Times New Roman"/>
+          <w:b w:val="0"/>
+          <w:i w:val="0"/>
+          <w:color w:val="2E3D50"/>
+          <w:sz w:val="18"/>
+        </w:rPr>
+        <w:t xml:space="preserve">   </w:t>
+      </w:r>
+      <w:hyperlink r:id="rId11">
+        <w:r>
+          <w:rPr>
+            <w:color w:val="2B7FFF"/>
+            <w:u w:val="single"/>
+            <w:sz w:val="18"/>
+            <w:szCs w:val="18"/>
+            <w:rFonts w:ascii="Times New Roman" w:hAnsi="Times New Roman"/>
+          </w:rPr>
+          <w:t xml:space="preserve">in/youness-jellouli</w:t>
+        </w:r>
+      </w:hyperlink>
+      <w:r>
+        <w:rPr>
+          <w:rFonts w:ascii="Times New Roman" w:hAnsi="Times New Roman" w:eastAsia="Times New Roman"/>
+          <w:b w:val="0"/>
+          <w:i w:val="0"/>
+          <w:color w:val="2E3D50"/>
+          <w:sz w:val="18"/>
+        </w:rPr>
+        <w:t xml:space="preserve">   </w:t>
+      </w:r>
+      <w:hyperlink r:id="rId12">
+        <w:r>
+          <w:rPr>
+            <w:color w:val="2B7FFF"/>
+            <w:u w:val="single"/>
+            <w:sz w:val="18"/>
+            <w:szCs w:val="18"/>
+            <w:rFonts w:ascii="Times New Roman" w:hAnsi="Times New Roman"/>
+          </w:rPr>
+          <w:t xml:space="preserve">jellyouness.com</w:t>
+        </w:r>
+      </w:hyperlink>
+    </w:p>
+    <w:p>
+      <w:pPr>
+        <w:spacing w:before="200" w:after="80" w:line="240" w:lineRule="auto"/>
+        <w:pBdr>
+          <w:bottom w:val="single" w:sz="12" w:space="1" w:color="2E3D50"/>
+        </w:pBdr>
+      </w:pPr>
+      <w:r>
+        <w:rPr>
+          <w:rFonts w:ascii="Times New Roman" w:hAnsi="Times New Roman" w:eastAsia="Times New Roman"/>
+          <w:b/>
+          <w:i w:val="0"/>
+          <w:color w:val="2E3D50"/>
+          <w:sz w:val="24"/>
+        </w:rPr>
+        <w:t>RÉSUMÉ</w:t>
       </w:r>
     </w:p>
     <w:p>
       <w:pPr>
-        <w:spacing w:before="0" w:after="0" w:line="240" w:lineRule="auto"/>
-        <w:jc w:val="center"/>
+        <w:spacing w:before="40" w:after="40" w:line="276" w:lineRule="auto"/>
       </w:pPr>
       <w:r>
         <w:rPr>
-          <w:rFonts w:ascii="Calibri" w:hAnsi="Calibri" w:eastAsia="Calibri"/>
+          <w:rFonts w:ascii="Times New Roman" w:hAnsi="Times New Roman" w:eastAsia="Times New Roman"/>
+          <w:b/>
+          <w:i w:val="0"/>
+          <w:color w:val="2E3D50"/>
+          <w:sz w:val="20"/>
+        </w:rPr>
+        <w:t>Développeur Full Stack</w:t>
+      </w:r>
+      <w:r>
+        <w:rPr>
+          <w:rFonts w:ascii="Times New Roman" w:hAnsi="Times New Roman" w:eastAsia="Times New Roman"/>
           <w:b w:val="0"/>
-          <w:color w:val="333333"/>
-          <w:sz w:val="19"/>
+          <w:i w:val="0"/>
+          <w:color w:val="2E3D50"/>
+          <w:sz w:val="20"/>
         </w:rPr>
-        <w:t>Casablanca, Morocco | younessjellouli12@gmail.com | +212 627 594 239</w:t>
+        <w:t xml:space="preserve"> proactif avec </w:t>
+      </w:r>
+      <w:r>
+        <w:rPr>
+          <w:rFonts w:ascii="Times New Roman" w:hAnsi="Times New Roman" w:eastAsia="Times New Roman"/>
+          <w:b/>
+          <w:i w:val="0"/>
+          <w:color w:val="2E3D50"/>
+          <w:sz w:val="20"/>
+        </w:rPr>
+        <w:t>+2 ans d'expérience</w:t>
+      </w:r>
+      <w:r>
+        <w:rPr>
+          <w:rFonts w:ascii="Times New Roman" w:hAnsi="Times New Roman" w:eastAsia="Times New Roman"/>
+          <w:b w:val="0"/>
+          <w:i w:val="0"/>
+          <w:color w:val="2E3D50"/>
+          <w:sz w:val="20"/>
+        </w:rPr>
+        <w:t xml:space="preserve"> dans le développement d'applications web innovantes pour divers projets publics tels que </w:t>
+      </w:r>
+      <w:hyperlink r:id="rId13">
+        <w:r>
+          <w:rPr>
+            <w:color w:val="2B7FFF"/>
+            <w:u w:val="single"/>
+            <w:sz w:val="20"/>
+            <w:szCs w:val="20"/>
+            <w:rFonts w:ascii="Times New Roman" w:hAnsi="Times New Roman"/>
+          </w:rPr>
+          <w:t xml:space="preserve">Wifina</w:t>
+        </w:r>
+      </w:hyperlink>
+      <w:r>
+        <w:rPr>
+          <w:rFonts w:ascii="Times New Roman" w:hAnsi="Times New Roman" w:eastAsia="Times New Roman"/>
+          <w:b w:val="0"/>
+          <w:i w:val="0"/>
+          <w:color w:val="2E3D50"/>
+          <w:sz w:val="20"/>
+        </w:rPr>
+        <w:t xml:space="preserve">, </w:t>
+      </w:r>
+      <w:hyperlink r:id="rId14">
+        <w:r>
+          <w:rPr>
+            <w:color w:val="2B7FFF"/>
+            <w:u w:val="single"/>
+            <w:sz w:val="20"/>
+            <w:szCs w:val="20"/>
+            <w:rFonts w:ascii="Times New Roman" w:hAnsi="Times New Roman"/>
+          </w:rPr>
+          <w:t xml:space="preserve">IBC</w:t>
+        </w:r>
+      </w:hyperlink>
+      <w:r>
+        <w:rPr>
+          <w:rFonts w:ascii="Times New Roman" w:hAnsi="Times New Roman" w:eastAsia="Times New Roman"/>
+          <w:b w:val="0"/>
+          <w:i w:val="0"/>
+          <w:color w:val="2E3D50"/>
+          <w:sz w:val="20"/>
+        </w:rPr>
+        <w:t xml:space="preserve">, </w:t>
+      </w:r>
+      <w:hyperlink r:id="rId15">
+        <w:r>
+          <w:rPr>
+            <w:color w:val="2B7FFF"/>
+            <w:u w:val="single"/>
+            <w:sz w:val="20"/>
+            <w:szCs w:val="20"/>
+            <w:rFonts w:ascii="Times New Roman" w:hAnsi="Times New Roman"/>
+          </w:rPr>
+          <w:t xml:space="preserve">oDoc</w:t>
+        </w:r>
+      </w:hyperlink>
+      <w:r>
+        <w:rPr>
+          <w:rFonts w:ascii="Times New Roman" w:hAnsi="Times New Roman" w:eastAsia="Times New Roman"/>
+          <w:b w:val="0"/>
+          <w:i w:val="0"/>
+          <w:color w:val="2E3D50"/>
+          <w:sz w:val="20"/>
+        </w:rPr>
+        <w:t xml:space="preserve">, </w:t>
+      </w:r>
+      <w:hyperlink r:id="rId16">
+        <w:r>
+          <w:rPr>
+            <w:color w:val="2B7FFF"/>
+            <w:u w:val="single"/>
+            <w:sz w:val="20"/>
+            <w:szCs w:val="20"/>
+            <w:rFonts w:ascii="Times New Roman" w:hAnsi="Times New Roman"/>
+          </w:rPr>
+          <w:t xml:space="preserve">AppartAli</w:t>
+        </w:r>
+      </w:hyperlink>
+      <w:r>
+        <w:rPr>
+          <w:rFonts w:ascii="Times New Roman" w:hAnsi="Times New Roman" w:eastAsia="Times New Roman"/>
+          <w:b w:val="0"/>
+          <w:i w:val="0"/>
+          <w:color w:val="2E3D50"/>
+          <w:sz w:val="20"/>
+        </w:rPr>
+        <w:t xml:space="preserve">, </w:t>
+      </w:r>
+      <w:hyperlink r:id="rId17">
+        <w:r>
+          <w:rPr>
+            <w:color w:val="2B7FFF"/>
+            <w:u w:val="single"/>
+            <w:sz w:val="20"/>
+            <w:szCs w:val="20"/>
+            <w:rFonts w:ascii="Times New Roman" w:hAnsi="Times New Roman"/>
+          </w:rPr>
+          <w:t xml:space="preserve">AVSM Club</w:t>
+        </w:r>
+      </w:hyperlink>
+      <w:r>
+        <w:rPr>
+          <w:rFonts w:ascii="Times New Roman" w:hAnsi="Times New Roman" w:eastAsia="Times New Roman"/>
+          <w:b w:val="0"/>
+          <w:i w:val="0"/>
+          <w:color w:val="2E3D50"/>
+          <w:sz w:val="20"/>
+        </w:rPr>
+        <w:t xml:space="preserve">, </w:t>
+      </w:r>
+      <w:hyperlink r:id="rId18">
+        <w:r>
+          <w:rPr>
+            <w:color w:val="2B7FFF"/>
+            <w:u w:val="single"/>
+            <w:sz w:val="20"/>
+            <w:szCs w:val="20"/>
+            <w:rFonts w:ascii="Times New Roman" w:hAnsi="Times New Roman"/>
+          </w:rPr>
+          <w:t xml:space="preserve">Invoicr SaaS</w:t>
+        </w:r>
+      </w:hyperlink>
+      <w:r>
+        <w:rPr>
+          <w:rFonts w:ascii="Times New Roman" w:hAnsi="Times New Roman" w:eastAsia="Times New Roman"/>
+          <w:b w:val="0"/>
+          <w:i w:val="0"/>
+          <w:color w:val="2E3D50"/>
+          <w:sz w:val="20"/>
+        </w:rPr>
+        <w:t xml:space="preserve"> and </w:t>
+      </w:r>
+      <w:hyperlink r:id="rId19">
+        <w:r>
+          <w:rPr>
+            <w:color w:val="2B7FFF"/>
+            <w:u w:val="single"/>
+            <w:sz w:val="20"/>
+            <w:szCs w:val="20"/>
+            <w:rFonts w:ascii="Times New Roman" w:hAnsi="Times New Roman"/>
+          </w:rPr>
+          <w:t xml:space="preserve">Allo Clients</w:t>
+        </w:r>
+      </w:hyperlink>
+      <w:r>
+        <w:rPr>
+          <w:rFonts w:ascii="Times New Roman" w:hAnsi="Times New Roman" w:eastAsia="Times New Roman"/>
+          <w:b w:val="0"/>
+          <w:i w:val="0"/>
+          <w:color w:val="2E3D50"/>
+          <w:sz w:val="20"/>
+        </w:rPr>
+        <w:t>. Pionnier des processus de développement de bout en bout, améliorant les performances des applications et l'engagement des utilisateurs grâce à une collaboration interfonctionnelle efficace. Recherche des opportunités pour tirer parti de son expertise en développement full stack afin de fournir des solutions de pointe et de favoriser l'avancement technologique.</w:t>
       </w:r>
     </w:p>
     <w:p>
       <w:pPr>
-        <w:spacing w:before="0" w:after="0" w:line="240" w:lineRule="auto"/>
-        <w:jc w:val="center"/>
+        <w:spacing w:before="200" w:after="80" w:line="240" w:lineRule="auto"/>
+        <w:pBdr>
+          <w:bottom w:val="single" w:sz="12" w:space="1" w:color="2E3D50"/>
+        </w:pBdr>
       </w:pPr>
       <w:r>
         <w:rPr>
-          <w:rFonts w:ascii="Calibri" w:hAnsi="Calibri" w:eastAsia="Calibri"/>
-          <w:b w:val="0"/>
-          <w:color w:val="333333"/>
-          <w:sz w:val="19"/>
+          <w:rFonts w:ascii="Times New Roman" w:hAnsi="Times New Roman" w:eastAsia="Times New Roman"/>
+          <w:b/>
+          <w:i w:val="0"/>
+          <w:color w:val="2E3D50"/>
+          <w:sz w:val="24"/>
         </w:rPr>
-        <w:t>linkedin.com/in/youness-jellouli | github.com/JellYouness | jellyouness.com</w:t>
+        <w:t>EXPÉRIENCE</w:t>
       </w:r>
     </w:p>
     <w:p>
       <w:pPr>
-        <w:pStyle w:val="Heading2"/>
-        <w:spacing w:before="160" w:after="40" w:line="240" w:lineRule="auto"/>
-        <w:pBdr>
-          <w:bottom w:val="single" w:sz="12" w:space="1" w:color="222222"/>
-        </w:pBdr>
+        <w:spacing w:before="140" w:after="0" w:line="252" w:lineRule="auto"/>
       </w:pPr>
       <w:r>
         <w:rPr>
-          <w:rFonts w:ascii="Calibri" w:hAnsi="Calibri" w:eastAsia="Calibri"/>
+          <w:rFonts w:ascii="Times New Roman" w:hAnsi="Times New Roman" w:eastAsia="Times New Roman"/>
           <w:b/>
-          <w:color w:val="111111"/>
-          <w:sz w:val="23"/>
+          <w:i w:val="0"/>
+          <w:color w:val="2E3D50"/>
+          <w:sz w:val="22"/>
         </w:rPr>
-        <w:t>PROFESSIONAL SUMMARY</w:t>
+        <w:t>FullStack Developer</w:t>
       </w:r>
     </w:p>
     <w:p>
       <w:pPr>
-        <w:spacing w:before="20" w:after="40" w:line="269" w:lineRule="auto"/>
+        <w:tabs>
+          <w:tab w:pos="10206" w:val="right"/>
+        </w:tabs>
+        <w:spacing w:before="0" w:after="20" w:line="240" w:lineRule="auto"/>
       </w:pPr>
       <w:r>
         <w:rPr>
-          <w:rFonts w:ascii="Calibri" w:hAnsi="Calibri" w:eastAsia="Calibri"/>
-          <w:b w:val="0"/>
+          <w:rFonts w:ascii="Times New Roman" w:hAnsi="Times New Roman" w:eastAsia="Times New Roman"/>
+          <w:b/>
+          <w:i w:val="0"/>
+          <w:color w:val="2E3D50"/>
           <w:sz w:val="21"/>
         </w:rPr>
-        <w:t>Full Stack Developer with 3+ years of experience building production web applications in Next.js, React, TypeScript, Node.js, and Laravel. Delivered client products across healthcare, fintech, and public-sector skills planning, including oDoc, Wifina, and IBC (2,000+ daily users at CyberScale). Owns features end to end: UI, REST APIs, databases, and deployment.</w:t>
-      </w:r>
-    </w:p>
-    <w:p>
-      <w:pPr>
-        <w:pStyle w:val="Heading2"/>
-        <w:spacing w:before="160" w:after="40" w:line="240" w:lineRule="auto"/>
-        <w:pBdr>
-          <w:bottom w:val="single" w:sz="12" w:space="1" w:color="222222"/>
-        </w:pBdr>
-      </w:pPr>
-      <w:r>
-        <w:rPr>
-          <w:rFonts w:ascii="Calibri" w:hAnsi="Calibri" w:eastAsia="Calibri"/>
-          <w:b/>
-          <w:color w:val="111111"/>
-          <w:sz w:val="23"/>
-        </w:rPr>
-        <w:t>SKILLS</w:t>
-      </w:r>
-    </w:p>
-    <w:p>
-      <w:pPr>
-        <w:spacing w:before="0" w:after="20" w:line="259" w:lineRule="auto"/>
-      </w:pPr>
-      <w:r>
-        <w:rPr>
-          <w:rFonts w:ascii="Calibri" w:hAnsi="Calibri" w:eastAsia="Calibri"/>
-          <w:b/>
-          <w:sz w:val="21"/>
-        </w:rPr>
-        <w:t xml:space="preserve">Languages: </w:t>
+        <w:t>SBS Data Factory</w:t>
       </w:r>
       <w:r>
         <w:rPr>
-          <w:rFonts w:ascii="Calibri" w:hAnsi="Calibri" w:eastAsia="Calibri"/>
+          <w:rFonts w:ascii="Times New Roman" w:hAnsi="Times New Roman" w:eastAsia="Times New Roman"/>
           <w:b w:val="0"/>
-          <w:sz w:val="21"/>
+          <w:i w:val="0"/>
+          <w:color w:val="2E3D50"/>
+          <w:sz w:val="20"/>
         </w:rPr>
-        <w:t>JavaScript, TypeScript, PHP, Python, SQL, HTML5, CSS3</w:t>
-      </w:r>
-    </w:p>
-    <w:p>
-      <w:pPr>
-        <w:spacing w:before="0" w:after="20" w:line="259" w:lineRule="auto"/>
-      </w:pPr>
-      <w:r>
-        <w:rPr>
-          <w:rFonts w:ascii="Calibri" w:hAnsi="Calibri" w:eastAsia="Calibri"/>
-          <w:b/>
-          <w:sz w:val="21"/>
-        </w:rPr>
-        <w:t xml:space="preserve">Frontend: </w:t>
-      </w:r>
-      <w:r>
-        <w:rPr>
-          <w:rFonts w:ascii="Calibri" w:hAnsi="Calibri" w:eastAsia="Calibri"/>
-          <w:b w:val="0"/>
-          <w:sz w:val="21"/>
-        </w:rPr>
-        <w:t>React.js, Next.js, Redux, Tailwind CSS, Material UI, shadcn/ui, React Native</w:t>
-      </w:r>
-    </w:p>
-    <w:p>
-      <w:pPr>
-        <w:spacing w:before="0" w:after="20" w:line="259" w:lineRule="auto"/>
-      </w:pPr>
-      <w:r>
-        <w:rPr>
-          <w:rFonts w:ascii="Calibri" w:hAnsi="Calibri" w:eastAsia="Calibri"/>
-          <w:b/>
-          <w:sz w:val="21"/>
-        </w:rPr>
-        <w:t xml:space="preserve">Backend / Data: </w:t>
-      </w:r>
-      <w:r>
-        <w:rPr>
-          <w:rFonts w:ascii="Calibri" w:hAnsi="Calibri" w:eastAsia="Calibri"/>
-          <w:b w:val="0"/>
-          <w:sz w:val="21"/>
-        </w:rPr>
-        <w:t>Node.js, Express.js, Laravel, REST APIs, Web Scraping, MySQL, PostgreSQL, Supabase, Prisma</w:t>
-      </w:r>
-    </w:p>
-    <w:p>
-      <w:pPr>
-        <w:spacing w:before="0" w:after="20" w:line="259" w:lineRule="auto"/>
-      </w:pPr>
-      <w:r>
-        <w:rPr>
-          <w:rFonts w:ascii="Calibri" w:hAnsi="Calibri" w:eastAsia="Calibri"/>
-          <w:b/>
-          <w:sz w:val="21"/>
-        </w:rPr>
-        <w:t xml:space="preserve">Cloud / Methods: </w:t>
-      </w:r>
-      <w:r>
-        <w:rPr>
-          <w:rFonts w:ascii="Calibri" w:hAnsi="Calibri" w:eastAsia="Calibri"/>
-          <w:b w:val="0"/>
-          <w:sz w:val="21"/>
-        </w:rPr>
-        <w:t>Git, GitHub Actions, Vercel, Google Cloud, Cloudflare, Agile, Scrum</w:t>
-      </w:r>
-    </w:p>
-    <w:p>
-      <w:pPr>
-        <w:pStyle w:val="Heading2"/>
-        <w:spacing w:before="160" w:after="40" w:line="240" w:lineRule="auto"/>
-        <w:pBdr>
-          <w:bottom w:val="single" w:sz="12" w:space="1" w:color="222222"/>
-        </w:pBdr>
-      </w:pPr>
-      <w:r>
-        <w:rPr>
-          <w:rFonts w:ascii="Calibri" w:hAnsi="Calibri" w:eastAsia="Calibri"/>
-          <w:b/>
-          <w:color w:val="111111"/>
-          <w:sz w:val="23"/>
-        </w:rPr>
-        <w:t>EXPERIENCE</w:t>
-      </w:r>
-    </w:p>
-    <w:p>
-      <w:pPr>
-        <w:spacing w:before="100" w:after="0" w:line="252" w:lineRule="auto"/>
-      </w:pPr>
-      <w:r>
-        <w:rPr>
-          <w:rFonts w:ascii="Calibri" w:hAnsi="Calibri" w:eastAsia="Calibri"/>
-          <w:b/>
-          <w:sz w:val="22"/>
-        </w:rPr>
-        <w:t>Full Stack Developer</w:t>
-      </w:r>
-      <w:r>
-        <w:rPr>
-          <w:rFonts w:ascii="Calibri" w:hAnsi="Calibri" w:eastAsia="Calibri"/>
-          <w:b w:val="0"/>
-          <w:sz w:val="21"/>
-        </w:rPr>
-        <w:t xml:space="preserve">  |  SBS Data Factory · Casablanca, Morocco · Oct 2025 – Present</w:t>
+        <w:tab/>
+        <w:t>Octobre 2025 - Présent, Casablanca, Maroc</w:t>
       </w:r>
     </w:p>
     <w:p>
       <w:pPr>
         <w:pStyle w:val="ListBullet"/>
-        <w:spacing w:before="0" w:after="0" w:line="259" w:lineRule="auto"/>
+        <w:spacing w:before="0" w:after="20" w:line="269" w:lineRule="auto"/>
       </w:pPr>
+      <w:hyperlink r:id="rId15">
+        <w:r>
+          <w:rPr>
+            <w:color w:val="2B7FFF"/>
+            <w:u w:val="single"/>
+            <w:sz w:val="20"/>
+            <w:szCs w:val="20"/>
+            <w:rFonts w:ascii="Times New Roman" w:hAnsi="Times New Roman"/>
+          </w:rPr>
+          <w:t xml:space="preserve">oDoc.ma</w:t>
+        </w:r>
+      </w:hyperlink>
       <w:r>
         <w:rPr>
-          <w:rFonts w:ascii="Calibri" w:hAnsi="Calibri" w:eastAsia="Calibri"/>
+          <w:rFonts w:ascii="Times New Roman" w:hAnsi="Times New Roman" w:eastAsia="Times New Roman"/>
           <w:b w:val="0"/>
-          <w:sz w:val="21"/>
+          <w:i w:val="0"/>
+          <w:color w:val="2E3D50"/>
+          <w:sz w:val="20"/>
         </w:rPr>
-        <w:t>Building oDoc.ma, a medical practice platform for appointment scheduling, patient profiles, prescriptions, and accounting, using React, TypeScript, Tailwind CSS, shadcn/ui, and Supabase.</w:t>
+        <w:t xml:space="preserve"> - Travaillé sur une application web moderne de planification médicale et de gestion de profils, fournissant des composants réutilisables pour la disponibilité des médecins, la prise de rendez-vous et les profils des patients, avec une interface utilisateur claire et réactive.</w:t>
       </w:r>
     </w:p>
     <w:p>
       <w:pPr>
         <w:pStyle w:val="ListBullet"/>
-        <w:spacing w:before="0" w:after="0" w:line="259" w:lineRule="auto"/>
+        <w:spacing w:before="0" w:after="20" w:line="269" w:lineRule="auto"/>
       </w:pPr>
       <w:r>
         <w:rPr>
-          <w:rFonts w:ascii="Calibri" w:hAnsi="Calibri" w:eastAsia="Calibri"/>
+          <w:rFonts w:ascii="Times New Roman" w:hAnsi="Times New Roman" w:eastAsia="Times New Roman"/>
+          <w:b/>
+          <w:i w:val="0"/>
+          <w:color w:val="2E3D50"/>
+          <w:sz w:val="20"/>
+        </w:rPr>
+        <w:t>Tech:</w:t>
+      </w:r>
+      <w:r>
+        <w:rPr>
+          <w:rFonts w:ascii="Times New Roman" w:hAnsi="Times New Roman" w:eastAsia="Times New Roman"/>
           <w:b w:val="0"/>
-          <w:sz w:val="21"/>
+          <w:i w:val="0"/>
+          <w:color w:val="2E3D50"/>
+          <w:sz w:val="20"/>
         </w:rPr>
-        <w:t>Delivered reusable booking and profile components and integrated WhatsApp chatbot support for patient communication.</w:t>
+        <w:t xml:space="preserve"> Nextjs, React, TypeScript, Tailwind CSS, Shadcn-ui, Supabase, Nestjs, PostgreSQL.</w:t>
       </w:r>
     </w:p>
     <w:p>
       <w:pPr>
-        <w:spacing w:before="100" w:after="0" w:line="252" w:lineRule="auto"/>
+        <w:spacing w:before="140" w:after="0" w:line="252" w:lineRule="auto"/>
       </w:pPr>
       <w:r>
         <w:rPr>
-          <w:rFonts w:ascii="Calibri" w:hAnsi="Calibri" w:eastAsia="Calibri"/>
+          <w:rFonts w:ascii="Times New Roman" w:hAnsi="Times New Roman" w:eastAsia="Times New Roman"/>
           <w:b/>
+          <w:i w:val="0"/>
+          <w:color w:val="2E3D50"/>
           <w:sz w:val="22"/>
         </w:rPr>
-        <w:t>Full Stack Developer</w:t>
+        <w:t>FullStack Developer</w:t>
+      </w:r>
+    </w:p>
+    <w:p>
+      <w:pPr>
+        <w:tabs>
+          <w:tab w:pos="10206" w:val="right"/>
+        </w:tabs>
+        <w:spacing w:before="0" w:after="20" w:line="240" w:lineRule="auto"/>
+      </w:pPr>
+      <w:r>
+        <w:rPr>
+          <w:rFonts w:ascii="Times New Roman" w:hAnsi="Times New Roman" w:eastAsia="Times New Roman"/>
+          <w:b/>
+          <w:i w:val="0"/>
+          <w:color w:val="2E3D50"/>
+          <w:sz w:val="21"/>
+        </w:rPr>
+        <w:t>CyberScale</w:t>
       </w:r>
       <w:r>
         <w:rPr>
-          <w:rFonts w:ascii="Calibri" w:hAnsi="Calibri" w:eastAsia="Calibri"/>
+          <w:rFonts w:ascii="Times New Roman" w:hAnsi="Times New Roman" w:eastAsia="Times New Roman"/>
           <w:b w:val="0"/>
-          <w:sz w:val="21"/>
+          <w:i w:val="0"/>
+          <w:color w:val="2E3D50"/>
+          <w:sz w:val="20"/>
         </w:rPr>
-        <w:t xml:space="preserve">  |  SMIAfrica · Casablanca, Morocco · Jun 2025 – Sep 2025</w:t>
+        <w:tab/>
+        <w:t>Juin 2024 - Juin 2025, France</w:t>
       </w:r>
     </w:p>
     <w:p>
       <w:pPr>
         <w:pStyle w:val="ListBullet"/>
-        <w:spacing w:before="0" w:after="0" w:line="259" w:lineRule="auto"/>
+        <w:spacing w:before="0" w:after="20" w:line="269" w:lineRule="auto"/>
       </w:pPr>
       <w:r>
         <w:rPr>
-          <w:rFonts w:ascii="Calibri" w:hAnsi="Calibri" w:eastAsia="Calibri"/>
+          <w:rFonts w:ascii="Times New Roman" w:hAnsi="Times New Roman" w:eastAsia="Times New Roman"/>
           <w:b w:val="0"/>
-          <w:sz w:val="21"/>
+          <w:i w:val="0"/>
+          <w:color w:val="2E3D50"/>
+          <w:sz w:val="20"/>
         </w:rPr>
-        <w:t>Shipped full-stack web features with Next.js, Node.js, and Laravel, including REST APIs and data workflows for client products.</w:t>
+        <w:t xml:space="preserve">Conception et maintenance d'applications web pour des projets publics, notamment </w:t>
       </w:r>
-    </w:p>
-    <w:p>
-      <w:pPr>
-        <w:spacing w:before="100" w:after="0" w:line="252" w:lineRule="auto"/>
-      </w:pPr>
+      <w:hyperlink r:id="rId13">
+        <w:r>
+          <w:rPr>
+            <w:color w:val="2B7FFF"/>
+            <w:u w:val="single"/>
+            <w:sz w:val="20"/>
+            <w:szCs w:val="20"/>
+            <w:rFonts w:ascii="Times New Roman" w:hAnsi="Times New Roman"/>
+          </w:rPr>
+          <w:t xml:space="preserve">Wifina</w:t>
+        </w:r>
+      </w:hyperlink>
       <w:r>
         <w:rPr>
-          <w:rFonts w:ascii="Calibri" w:hAnsi="Calibri" w:eastAsia="Calibri"/>
-          <w:b/>
-          <w:sz w:val="22"/>
+          <w:rFonts w:ascii="Times New Roman" w:hAnsi="Times New Roman" w:eastAsia="Times New Roman"/>
+          <w:b w:val="0"/>
+          <w:i w:val="0"/>
+          <w:color w:val="2E3D50"/>
+          <w:sz w:val="20"/>
         </w:rPr>
-        <w:t>Full Stack Developer</w:t>
+        <w:t xml:space="preserve">, </w:t>
+      </w:r>
+      <w:hyperlink r:id="rId14">
+        <w:r>
+          <w:rPr>
+            <w:color w:val="2B7FFF"/>
+            <w:u w:val="single"/>
+            <w:sz w:val="20"/>
+            <w:szCs w:val="20"/>
+            <w:rFonts w:ascii="Times New Roman" w:hAnsi="Times New Roman"/>
+          </w:rPr>
+          <w:t xml:space="preserve">IBC</w:t>
+        </w:r>
+      </w:hyperlink>
+      <w:r>
+        <w:rPr>
+          <w:rFonts w:ascii="Times New Roman" w:hAnsi="Times New Roman" w:eastAsia="Times New Roman"/>
+          <w:b w:val="0"/>
+          <w:i w:val="0"/>
+          <w:color w:val="2E3D50"/>
+          <w:sz w:val="20"/>
+        </w:rPr>
+        <w:t xml:space="preserve">, </w:t>
+      </w:r>
+      <w:hyperlink r:id="rId19">
+        <w:r>
+          <w:rPr>
+            <w:color w:val="2B7FFF"/>
+            <w:u w:val="single"/>
+            <w:sz w:val="20"/>
+            <w:szCs w:val="20"/>
+            <w:rFonts w:ascii="Times New Roman" w:hAnsi="Times New Roman"/>
+          </w:rPr>
+          <w:t xml:space="preserve">Allo Reflexo</w:t>
+        </w:r>
+      </w:hyperlink>
+      <w:r>
+        <w:rPr>
+          <w:rFonts w:ascii="Times New Roman" w:hAnsi="Times New Roman" w:eastAsia="Times New Roman"/>
+          <w:b w:val="0"/>
+          <w:i w:val="0"/>
+          <w:color w:val="2E3D50"/>
+          <w:sz w:val="20"/>
+        </w:rPr>
+        <w:t xml:space="preserve">, and </w:t>
+      </w:r>
+      <w:hyperlink r:id="rId20">
+        <w:r>
+          <w:rPr>
+            <w:color w:val="2B7FFF"/>
+            <w:u w:val="single"/>
+            <w:sz w:val="20"/>
+            <w:szCs w:val="20"/>
+            <w:rFonts w:ascii="Times New Roman" w:hAnsi="Times New Roman"/>
+          </w:rPr>
+          <w:t xml:space="preserve">CyberScale</w:t>
+        </w:r>
+      </w:hyperlink>
+      <w:r>
+        <w:rPr>
+          <w:rFonts w:ascii="Times New Roman" w:hAnsi="Times New Roman" w:eastAsia="Times New Roman"/>
+          <w:b w:val="0"/>
+          <w:i w:val="0"/>
+          <w:color w:val="2E3D50"/>
+          <w:sz w:val="20"/>
+        </w:rPr>
+        <w:t xml:space="preserve">, Desservant en moyenne </w:t>
       </w:r>
       <w:r>
         <w:rPr>
-          <w:rFonts w:ascii="Calibri" w:hAnsi="Calibri" w:eastAsia="Calibri"/>
+          <w:rFonts w:ascii="Times New Roman" w:hAnsi="Times New Roman" w:eastAsia="Times New Roman"/>
+          <w:b/>
+          <w:i w:val="0"/>
+          <w:color w:val="2E3D50"/>
+          <w:sz w:val="20"/>
+        </w:rPr>
+        <w:t>+3 000</w:t>
+      </w:r>
+      <w:r>
+        <w:rPr>
+          <w:rFonts w:ascii="Times New Roman" w:hAnsi="Times New Roman" w:eastAsia="Times New Roman"/>
           <w:b w:val="0"/>
-          <w:sz w:val="21"/>
+          <w:i w:val="0"/>
+          <w:color w:val="2E3D50"/>
+          <w:sz w:val="20"/>
         </w:rPr>
-        <w:t xml:space="preserve">  |  CyberScale · France · Jun 2024 – Jun 2025</w:t>
+        <w:t xml:space="preserve"> utilisateurs actifs par jour, ce qui témoigne d'une grande fiabilité.</w:t>
       </w:r>
     </w:p>
     <w:p>
       <w:pPr>
         <w:pStyle w:val="ListBullet"/>
-        <w:spacing w:before="0" w:after="0" w:line="259" w:lineRule="auto"/>
+        <w:spacing w:before="0" w:after="20" w:line="269" w:lineRule="auto"/>
       </w:pPr>
       <w:r>
         <w:rPr>
-          <w:rFonts w:ascii="Calibri" w:hAnsi="Calibri" w:eastAsia="Calibri"/>
+          <w:rFonts w:ascii="Times New Roman" w:hAnsi="Times New Roman" w:eastAsia="Times New Roman"/>
           <w:b w:val="0"/>
-          <w:sz w:val="21"/>
+          <w:i w:val="0"/>
+          <w:color w:val="2E3D50"/>
+          <w:sz w:val="20"/>
         </w:rPr>
-        <w:t>Built and maintained public web apps including Wifina, IBC, and Allo Reflexo, serving 2,000+ average daily active users.</w:t>
+        <w:t xml:space="preserve">A orchestré la collaboration entre les équipes front-end, back-end et QA pour améliorer les performances des applications de </w:t>
+      </w:r>
+      <w:r>
+        <w:rPr>
+          <w:rFonts w:ascii="Times New Roman" w:hAnsi="Times New Roman" w:eastAsia="Times New Roman"/>
+          <w:b/>
+          <w:i w:val="0"/>
+          <w:color w:val="2E3D50"/>
+          <w:sz w:val="20"/>
+        </w:rPr>
+        <w:t>25%</w:t>
+      </w:r>
+      <w:r>
+        <w:rPr>
+          <w:rFonts w:ascii="Times New Roman" w:hAnsi="Times New Roman" w:eastAsia="Times New Roman"/>
+          <w:b w:val="0"/>
+          <w:i w:val="0"/>
+          <w:color w:val="2E3D50"/>
+          <w:sz w:val="20"/>
+        </w:rPr>
+        <w:t xml:space="preserve"> grâce à l'optimisation du code et à la rationalisation des processus de déploiement, tout en assurant l'évolutivité et les meilleures pratiques de codage.</w:t>
       </w:r>
     </w:p>
     <w:p>
       <w:pPr>
         <w:pStyle w:val="ListBullet"/>
-        <w:spacing w:before="0" w:after="0" w:line="259" w:lineRule="auto"/>
+        <w:spacing w:before="0" w:after="20" w:line="269" w:lineRule="auto"/>
       </w:pPr>
       <w:r>
         <w:rPr>
-          <w:rFonts w:ascii="Calibri" w:hAnsi="Calibri" w:eastAsia="Calibri"/>
+          <w:rFonts w:ascii="Times New Roman" w:hAnsi="Times New Roman" w:eastAsia="Times New Roman"/>
+          <w:b/>
+          <w:i w:val="0"/>
+          <w:color w:val="2E3D50"/>
+          <w:sz w:val="20"/>
+        </w:rPr>
+        <w:t>Tech:</w:t>
+      </w:r>
+      <w:r>
+        <w:rPr>
+          <w:rFonts w:ascii="Times New Roman" w:hAnsi="Times New Roman" w:eastAsia="Times New Roman"/>
           <w:b w:val="0"/>
-          <w:sz w:val="21"/>
+          <w:i w:val="0"/>
+          <w:color w:val="2E3D50"/>
+          <w:sz w:val="20"/>
         </w:rPr>
-        <w:t>Improved application performance by 25% with front-end, back-end, and QA collaboration. Delivered Wifina (Next.js, TypeScript, Laravel) and IBC, a skills-anticipation tool for Centre-Val de Loire, France.</w:t>
+        <w:t xml:space="preserve"> Nextjs, React, Typescript, MaterialUI, Laravel, Nodejs, Expressjs, MySQL.</w:t>
       </w:r>
     </w:p>
     <w:p>
       <w:pPr>
-        <w:spacing w:before="100" w:after="0" w:line="252" w:lineRule="auto"/>
+        <w:spacing w:before="140" w:after="0" w:line="252" w:lineRule="auto"/>
       </w:pPr>
       <w:r>
         <w:rPr>
-          <w:rFonts w:ascii="Calibri" w:hAnsi="Calibri" w:eastAsia="Calibri"/>
+          <w:rFonts w:ascii="Times New Roman" w:hAnsi="Times New Roman" w:eastAsia="Times New Roman"/>
           <w:b/>
+          <w:i w:val="0"/>
+          <w:color w:val="2E3D50"/>
           <w:sz w:val="22"/>
         </w:rPr>
-        <w:t>Junior Cloud Consultant Intern</w:t>
+        <w:t>Consultant Cloud junior - Stagiaire</w:t>
+      </w:r>
+    </w:p>
+    <w:p>
+      <w:pPr>
+        <w:tabs>
+          <w:tab w:pos="10206" w:val="right"/>
+        </w:tabs>
+        <w:spacing w:before="0" w:after="20" w:line="240" w:lineRule="auto"/>
+      </w:pPr>
+      <w:r>
+        <w:rPr>
+          <w:rFonts w:ascii="Times New Roman" w:hAnsi="Times New Roman" w:eastAsia="Times New Roman"/>
+          <w:b/>
+          <w:i w:val="0"/>
+          <w:color w:val="2E3D50"/>
+          <w:sz w:val="21"/>
+        </w:rPr>
+        <w:t>CBI</w:t>
       </w:r>
       <w:r>
         <w:rPr>
-          <w:rFonts w:ascii="Calibri" w:hAnsi="Calibri" w:eastAsia="Calibri"/>
+          <w:rFonts w:ascii="Times New Roman" w:hAnsi="Times New Roman" w:eastAsia="Times New Roman"/>
           <w:b w:val="0"/>
-          <w:sz w:val="21"/>
+          <w:i w:val="0"/>
+          <w:color w:val="2E3D50"/>
+          <w:sz w:val="20"/>
         </w:rPr>
-        <w:t xml:space="preserve">  |  CBI · Casablanca, Morocco · Sep 2023 – Jan 2024</w:t>
+        <w:tab/>
+        <w:t>Septembre 2023 - Janvier 2024, Casablanca, Morocco</w:t>
       </w:r>
     </w:p>
     <w:p>
       <w:pPr>
         <w:pStyle w:val="ListBullet"/>
-        <w:spacing w:before="0" w:after="0" w:line="259" w:lineRule="auto"/>
+        <w:spacing w:before="0" w:after="20" w:line="269" w:lineRule="auto"/>
       </w:pPr>
       <w:r>
         <w:rPr>
-          <w:rFonts w:ascii="Calibri" w:hAnsi="Calibri" w:eastAsia="Calibri"/>
+          <w:rFonts w:ascii="Times New Roman" w:hAnsi="Times New Roman" w:eastAsia="Times New Roman"/>
           <w:b w:val="0"/>
-          <w:sz w:val="21"/>
+          <w:i w:val="0"/>
+          <w:color w:val="2E3D50"/>
+          <w:sz w:val="20"/>
         </w:rPr>
-        <w:t>Supported pre-sales and Microsoft CSP subscription management (MWP) for 100+ clients, mapping business needs to cloud offers.</w:t>
-      </w:r>
-    </w:p>
-    <w:p>
-      <w:pPr>
-        <w:spacing w:before="100" w:after="0" w:line="252" w:lineRule="auto"/>
-      </w:pPr>
-      <w:r>
-        <w:rPr>
-          <w:rFonts w:ascii="Calibri" w:hAnsi="Calibri" w:eastAsia="Calibri"/>
-          <w:b/>
-          <w:sz w:val="22"/>
-        </w:rPr>
-        <w:t>Junior Full Stack Developer</w:t>
+        <w:t xml:space="preserve">A assisté aux activités de pré-vente et a fourni un support dans la création d'offres Microsoft pour </w:t>
       </w:r>
       <w:r>
         <w:rPr>
-          <w:rFonts w:ascii="Calibri" w:hAnsi="Calibri" w:eastAsia="Calibri"/>
+          <w:rFonts w:ascii="Times New Roman" w:hAnsi="Times New Roman" w:eastAsia="Times New Roman"/>
+          <w:b/>
+          <w:i w:val="0"/>
+          <w:color w:val="2E3D50"/>
+          <w:sz w:val="20"/>
+        </w:rPr>
+        <w:t>+100</w:t>
+      </w:r>
+      <w:r>
+        <w:rPr>
+          <w:rFonts w:ascii="Times New Roman" w:hAnsi="Times New Roman" w:eastAsia="Times New Roman"/>
           <w:b w:val="0"/>
-          <w:sz w:val="21"/>
+          <w:i w:val="0"/>
+          <w:color w:val="2E3D50"/>
+          <w:sz w:val="20"/>
         </w:rPr>
-        <w:t xml:space="preserve">  |  IS-TECH · Casablanca, Morocco · Apr 2023 – Aug 2023</w:t>
+        <w:t xml:space="preserve"> clients.</w:t>
       </w:r>
     </w:p>
     <w:p>
       <w:pPr>
         <w:pStyle w:val="ListBullet"/>
-        <w:spacing w:before="0" w:after="0" w:line="259" w:lineRule="auto"/>
+        <w:spacing w:before="0" w:after="20" w:line="269" w:lineRule="auto"/>
       </w:pPr>
       <w:r>
         <w:rPr>
-          <w:rFonts w:ascii="Calibri" w:hAnsi="Calibri" w:eastAsia="Calibri"/>
+          <w:rFonts w:ascii="Times New Roman" w:hAnsi="Times New Roman" w:eastAsia="Times New Roman"/>
           <w:b w:val="0"/>
-          <w:sz w:val="21"/>
+          <w:i w:val="0"/>
+          <w:color w:val="2E3D50"/>
+          <w:sz w:val="20"/>
         </w:rPr>
-        <w:t>Developed interactive React.js and Laravel applications, managed complex state with Redux, and integrated REST APIs into reusable UI modules.</w:t>
-      </w:r>
-    </w:p>
-    <w:p>
-      <w:pPr>
-        <w:spacing w:before="100" w:after="0" w:line="252" w:lineRule="auto"/>
-      </w:pPr>
-      <w:r>
-        <w:rPr>
-          <w:rFonts w:ascii="Calibri" w:hAnsi="Calibri" w:eastAsia="Calibri"/>
-          <w:b/>
-          <w:sz w:val="22"/>
-        </w:rPr>
-        <w:t>Full Stack Developer Intern</w:t>
-      </w:r>
-      <w:r>
-        <w:rPr>
-          <w:rFonts w:ascii="Calibri" w:hAnsi="Calibri" w:eastAsia="Calibri"/>
-          <w:b w:val="0"/>
-          <w:sz w:val="21"/>
-        </w:rPr>
-        <w:t xml:space="preserve">  |  Palmeraie Country Club · Casablanca, Morocco · Jul 2022 – Sep 2022</w:t>
+        <w:t>A géré les abonnements Microsoft via MWP (Microsoft Subscription Management - CSP), aidant les clients à optimiser leurs solutions cloud.</w:t>
       </w:r>
     </w:p>
     <w:p>
       <w:pPr>
         <w:pStyle w:val="ListBullet"/>
-        <w:spacing w:before="0" w:after="0" w:line="259" w:lineRule="auto"/>
+        <w:spacing w:before="0" w:after="20" w:line="269" w:lineRule="auto"/>
       </w:pPr>
       <w:r>
         <w:rPr>
-          <w:rFonts w:ascii="Calibri" w:hAnsi="Calibri" w:eastAsia="Calibri"/>
+          <w:rFonts w:ascii="Times New Roman" w:hAnsi="Times New Roman" w:eastAsia="Times New Roman"/>
           <w:b w:val="0"/>
-          <w:sz w:val="21"/>
+          <w:i w:val="0"/>
+          <w:color w:val="2E3D50"/>
+          <w:sz w:val="20"/>
         </w:rPr>
-        <w:t>Implemented a membership and subscription management app with HTML, CSS, JavaScript, PHP, and MySQL.</w:t>
+        <w:t>A collaboré avec les clients pour comprendre les besoins et a fourni des solutions cloud Microsoft et améliorer leurs opérations commerciales.</w:t>
       </w:r>
     </w:p>
     <w:p>
       <w:pPr>
-        <w:pStyle w:val="Heading2"/>
-        <w:spacing w:before="160" w:after="40" w:line="240" w:lineRule="auto"/>
+        <w:spacing w:before="140" w:after="0" w:line="252" w:lineRule="auto"/>
+      </w:pPr>
+      <w:r>
+        <w:rPr>
+          <w:rFonts w:ascii="Times New Roman" w:hAnsi="Times New Roman" w:eastAsia="Times New Roman"/>
+          <w:b/>
+          <w:i w:val="0"/>
+          <w:color w:val="2E3D50"/>
+          <w:sz w:val="22"/>
+        </w:rPr>
+        <w:t>Junior FullStack Developer</w:t>
+      </w:r>
+    </w:p>
+    <w:p>
+      <w:pPr>
+        <w:tabs>
+          <w:tab w:pos="10206" w:val="right"/>
+        </w:tabs>
+        <w:spacing w:before="0" w:after="20" w:line="240" w:lineRule="auto"/>
+      </w:pPr>
+      <w:r>
+        <w:rPr>
+          <w:rFonts w:ascii="Times New Roman" w:hAnsi="Times New Roman" w:eastAsia="Times New Roman"/>
+          <w:b/>
+          <w:i w:val="0"/>
+          <w:color w:val="2E3D50"/>
+          <w:sz w:val="21"/>
+        </w:rPr>
+        <w:t>IS-TECH</w:t>
+      </w:r>
+      <w:r>
+        <w:rPr>
+          <w:rFonts w:ascii="Times New Roman" w:hAnsi="Times New Roman" w:eastAsia="Times New Roman"/>
+          <w:b w:val="0"/>
+          <w:i w:val="0"/>
+          <w:color w:val="2E3D50"/>
+          <w:sz w:val="20"/>
+        </w:rPr>
+        <w:tab/>
+        <w:t>Juillet 2023 - Novembre 2023, Casablanca, Morocco</w:t>
+      </w:r>
+    </w:p>
+    <w:p>
+      <w:pPr>
+        <w:pStyle w:val="ListBullet"/>
+        <w:spacing w:before="0" w:after="20" w:line="269" w:lineRule="auto"/>
+      </w:pPr>
+      <w:r>
+        <w:rPr>
+          <w:rFonts w:ascii="Times New Roman" w:hAnsi="Times New Roman" w:eastAsia="Times New Roman"/>
+          <w:b w:val="0"/>
+          <w:i w:val="0"/>
+          <w:color w:val="2E3D50"/>
+          <w:sz w:val="20"/>
+        </w:rPr>
+        <w:t>A conçu et développé des applications web interactives.</w:t>
+      </w:r>
+    </w:p>
+    <w:p>
+      <w:pPr>
+        <w:pStyle w:val="ListBullet"/>
+        <w:spacing w:before="0" w:after="20" w:line="269" w:lineRule="auto"/>
+      </w:pPr>
+      <w:r>
+        <w:rPr>
+          <w:rFonts w:ascii="Times New Roman" w:hAnsi="Times New Roman" w:eastAsia="Times New Roman"/>
+          <w:b w:val="0"/>
+          <w:i w:val="0"/>
+          <w:color w:val="2E3D50"/>
+          <w:sz w:val="20"/>
+        </w:rPr>
+        <w:t>A intégré des API RESTful pour étendre les fonctionnalités de l'application principale, améliorant l'expérience utilisateur et rationalisant le flux de données à travers plusieurs modules.</w:t>
+      </w:r>
+    </w:p>
+    <w:p>
+      <w:pPr>
+        <w:pStyle w:val="ListBullet"/>
+        <w:spacing w:before="0" w:after="20" w:line="269" w:lineRule="auto"/>
+      </w:pPr>
+      <w:r>
+        <w:rPr>
+          <w:rFonts w:ascii="Times New Roman" w:hAnsi="Times New Roman" w:eastAsia="Times New Roman"/>
+          <w:b/>
+          <w:i w:val="0"/>
+          <w:color w:val="2E3D50"/>
+          <w:sz w:val="20"/>
+        </w:rPr>
+        <w:t>Tech:</w:t>
+      </w:r>
+      <w:r>
+        <w:rPr>
+          <w:rFonts w:ascii="Times New Roman" w:hAnsi="Times New Roman" w:eastAsia="Times New Roman"/>
+          <w:b w:val="0"/>
+          <w:i w:val="0"/>
+          <w:color w:val="2E3D50"/>
+          <w:sz w:val="20"/>
+        </w:rPr>
+        <w:t xml:space="preserve"> React, Javascript, MaterialUI, Redux, Laravel, MySQL.</w:t>
+      </w:r>
+    </w:p>
+    <w:p>
+      <w:pPr>
+        <w:spacing w:before="140" w:after="0" w:line="252" w:lineRule="auto"/>
+      </w:pPr>
+      <w:r>
+        <w:rPr>
+          <w:rFonts w:ascii="Times New Roman" w:hAnsi="Times New Roman" w:eastAsia="Times New Roman"/>
+          <w:b/>
+          <w:i w:val="0"/>
+          <w:color w:val="2E3D50"/>
+          <w:sz w:val="22"/>
+        </w:rPr>
+        <w:t>FullStack Developer Intern</w:t>
+      </w:r>
+    </w:p>
+    <w:p>
+      <w:pPr>
+        <w:tabs>
+          <w:tab w:pos="10206" w:val="right"/>
+        </w:tabs>
+        <w:spacing w:before="0" w:after="20" w:line="240" w:lineRule="auto"/>
+      </w:pPr>
+      <w:r>
+        <w:rPr>
+          <w:rFonts w:ascii="Times New Roman" w:hAnsi="Times New Roman" w:eastAsia="Times New Roman"/>
+          <w:b/>
+          <w:i w:val="0"/>
+          <w:color w:val="2E3D50"/>
+          <w:sz w:val="21"/>
+        </w:rPr>
+        <w:t>Palmeraie Country Club</w:t>
+      </w:r>
+      <w:r>
+        <w:rPr>
+          <w:rFonts w:ascii="Times New Roman" w:hAnsi="Times New Roman" w:eastAsia="Times New Roman"/>
+          <w:b w:val="0"/>
+          <w:i w:val="0"/>
+          <w:color w:val="2E3D50"/>
+          <w:sz w:val="20"/>
+        </w:rPr>
+        <w:tab/>
+        <w:t>Juillet 2022 - Septembre 2022, Casablanca, Morocco</w:t>
+      </w:r>
+    </w:p>
+    <w:p>
+      <w:pPr>
+        <w:pStyle w:val="ListBullet"/>
+        <w:spacing w:before="0" w:after="20" w:line="269" w:lineRule="auto"/>
+      </w:pPr>
+      <w:r>
+        <w:rPr>
+          <w:rFonts w:ascii="Times New Roman" w:hAnsi="Times New Roman" w:eastAsia="Times New Roman"/>
+          <w:b w:val="0"/>
+          <w:i w:val="0"/>
+          <w:color w:val="2E3D50"/>
+          <w:sz w:val="20"/>
+        </w:rPr>
+        <w:t>A conçu et développé une application web pour la gestion des adhésions et des abonnements utilisant HTML, CSS, JavaScript, PHP et MySQL.</w:t>
+      </w:r>
+    </w:p>
+    <w:p>
+      <w:pPr>
+        <w:spacing w:before="200" w:after="80" w:line="240" w:lineRule="auto"/>
         <w:pBdr>
-          <w:bottom w:val="single" w:sz="12" w:space="1" w:color="222222"/>
+          <w:bottom w:val="single" w:sz="12" w:space="1" w:color="2E3D50"/>
         </w:pBdr>
       </w:pPr>
       <w:r>
         <w:rPr>
-          <w:rFonts w:ascii="Calibri" w:hAnsi="Calibri" w:eastAsia="Calibri"/>
+          <w:rFonts w:ascii="Times New Roman" w:hAnsi="Times New Roman" w:eastAsia="Times New Roman"/>
           <w:b/>
-          <w:color w:val="111111"/>
-          <w:sz w:val="23"/>
+          <w:i w:val="0"/>
+          <w:color w:val="2E3D50"/>
+          <w:sz w:val="24"/>
         </w:rPr>
-        <w:t>PROJECTS</w:t>
+        <w:t>COMPÉTENCES</w:t>
+      </w:r>
+    </w:p>
+    <w:p>
+      <w:pPr>
+        <w:spacing w:before="20" w:after="20" w:line="269" w:lineRule="auto"/>
+      </w:pPr>
+      <w:r>
+        <w:rPr>
+          <w:rFonts w:ascii="Times New Roman" w:hAnsi="Times New Roman" w:eastAsia="Times New Roman"/>
+          <w:b/>
+          <w:i w:val="0"/>
+          <w:color w:val="2E3D50"/>
+          <w:sz w:val="20"/>
+        </w:rPr>
+        <w:t xml:space="preserve">Langages de programmation: </w:t>
+      </w:r>
+      <w:r>
+        <w:rPr>
+          <w:rFonts w:ascii="Times New Roman" w:hAnsi="Times New Roman" w:eastAsia="Times New Roman"/>
+          <w:b w:val="0"/>
+          <w:i w:val="0"/>
+          <w:color w:val="2E3D50"/>
+          <w:sz w:val="20"/>
+        </w:rPr>
+        <w:t>JavaScript, TypeScript, PHP, Python, Java, C/C++</w:t>
+      </w:r>
+    </w:p>
+    <w:p>
+      <w:pPr>
+        <w:spacing w:before="20" w:after="20" w:line="269" w:lineRule="auto"/>
+      </w:pPr>
+      <w:r>
+        <w:rPr>
+          <w:rFonts w:ascii="Times New Roman" w:hAnsi="Times New Roman" w:eastAsia="Times New Roman"/>
+          <w:b/>
+          <w:i w:val="0"/>
+          <w:color w:val="2E3D50"/>
+          <w:sz w:val="20"/>
+        </w:rPr>
+        <w:t xml:space="preserve">Frontend/ Backend: </w:t>
+      </w:r>
+      <w:r>
+        <w:rPr>
+          <w:rFonts w:ascii="Times New Roman" w:hAnsi="Times New Roman" w:eastAsia="Times New Roman"/>
+          <w:b w:val="0"/>
+          <w:i w:val="0"/>
+          <w:color w:val="2E3D50"/>
+          <w:sz w:val="20"/>
+        </w:rPr>
+        <w:t>React.js, Next.js, Express, Node.js, Laravel</w:t>
+      </w:r>
+    </w:p>
+    <w:p>
+      <w:pPr>
+        <w:spacing w:before="20" w:after="20" w:line="269" w:lineRule="auto"/>
+      </w:pPr>
+      <w:r>
+        <w:rPr>
+          <w:rFonts w:ascii="Times New Roman" w:hAnsi="Times New Roman" w:eastAsia="Times New Roman"/>
+          <w:b/>
+          <w:i w:val="0"/>
+          <w:color w:val="2E3D50"/>
+          <w:sz w:val="20"/>
+        </w:rPr>
+        <w:t xml:space="preserve">Services Cloud: </w:t>
+      </w:r>
+      <w:r>
+        <w:rPr>
+          <w:rFonts w:ascii="Times New Roman" w:hAnsi="Times New Roman" w:eastAsia="Times New Roman"/>
+          <w:b w:val="0"/>
+          <w:i w:val="0"/>
+          <w:color w:val="2E3D50"/>
+          <w:sz w:val="20"/>
+        </w:rPr>
+        <w:t>Google Cloud, Vercel, Cloudflare</w:t>
+      </w:r>
+    </w:p>
+    <w:p>
+      <w:pPr>
+        <w:spacing w:before="20" w:after="20" w:line="269" w:lineRule="auto"/>
+      </w:pPr>
+      <w:r>
+        <w:rPr>
+          <w:rFonts w:ascii="Times New Roman" w:hAnsi="Times New Roman" w:eastAsia="Times New Roman"/>
+          <w:b/>
+          <w:i w:val="0"/>
+          <w:color w:val="2E3D50"/>
+          <w:sz w:val="20"/>
+        </w:rPr>
+        <w:t xml:space="preserve">Database: </w:t>
+      </w:r>
+      <w:r>
+        <w:rPr>
+          <w:rFonts w:ascii="Times New Roman" w:hAnsi="Times New Roman" w:eastAsia="Times New Roman"/>
+          <w:b w:val="0"/>
+          <w:i w:val="0"/>
+          <w:color w:val="2E3D50"/>
+          <w:sz w:val="20"/>
+        </w:rPr>
+        <w:t>MySQL, PostgreSQL, Supabase, MongoDB</w:t>
+      </w:r>
+    </w:p>
+    <w:p>
+      <w:pPr>
+        <w:spacing w:before="20" w:after="20" w:line="269" w:lineRule="auto"/>
+      </w:pPr>
+      <w:r>
+        <w:rPr>
+          <w:rFonts w:ascii="Times New Roman" w:hAnsi="Times New Roman" w:eastAsia="Times New Roman"/>
+          <w:b/>
+          <w:i w:val="0"/>
+          <w:color w:val="2E3D50"/>
+          <w:sz w:val="20"/>
+        </w:rPr>
+        <w:t xml:space="preserve">Intelligence Artificiel/ AI: </w:t>
+      </w:r>
+      <w:r>
+        <w:rPr>
+          <w:rFonts w:ascii="Times New Roman" w:hAnsi="Times New Roman" w:eastAsia="Times New Roman"/>
+          <w:b w:val="0"/>
+          <w:i w:val="0"/>
+          <w:color w:val="2E3D50"/>
+          <w:sz w:val="20"/>
+        </w:rPr>
+        <w:t>OpenAI API, Claude, Cursor, Copilot, DeepSeek, Ollama, n8n</w:t>
+      </w:r>
+    </w:p>
+    <w:p>
+      <w:pPr>
+        <w:spacing w:before="20" w:after="20" w:line="269" w:lineRule="auto"/>
+      </w:pPr>
+      <w:r>
+        <w:rPr>
+          <w:rFonts w:ascii="Times New Roman" w:hAnsi="Times New Roman" w:eastAsia="Times New Roman"/>
+          <w:b/>
+          <w:i w:val="0"/>
+          <w:color w:val="2E3D50"/>
+          <w:sz w:val="20"/>
+        </w:rPr>
+        <w:t xml:space="preserve">Méthodologies: </w:t>
+      </w:r>
+      <w:r>
+        <w:rPr>
+          <w:rFonts w:ascii="Times New Roman" w:hAnsi="Times New Roman" w:eastAsia="Times New Roman"/>
+          <w:b w:val="0"/>
+          <w:i w:val="0"/>
+          <w:color w:val="2E3D50"/>
+          <w:sz w:val="20"/>
+        </w:rPr>
+        <w:t>Agile, Scrum, Kanban, Design Pattern, Web Architecture</w:t>
+      </w:r>
+    </w:p>
+    <w:p>
+      <w:pPr>
+        <w:spacing w:before="20" w:after="20" w:line="269" w:lineRule="auto"/>
+      </w:pPr>
+      <w:r>
+        <w:rPr>
+          <w:rFonts w:ascii="Times New Roman" w:hAnsi="Times New Roman" w:eastAsia="Times New Roman"/>
+          <w:b/>
+          <w:i w:val="0"/>
+          <w:color w:val="2E3D50"/>
+          <w:sz w:val="20"/>
+        </w:rPr>
+        <w:t xml:space="preserve">Soft Skills: </w:t>
+      </w:r>
+      <w:r>
+        <w:rPr>
+          <w:rFonts w:ascii="Times New Roman" w:hAnsi="Times New Roman" w:eastAsia="Times New Roman"/>
+          <w:b w:val="0"/>
+          <w:i w:val="0"/>
+          <w:color w:val="2E3D50"/>
+          <w:sz w:val="20"/>
+        </w:rPr>
+        <w:t>Communication, collaboration en équipe, résolution de problèmes, gestion du temps, adaptabilité</w:t>
+      </w:r>
+    </w:p>
+    <w:p>
+      <w:pPr>
+        <w:spacing w:before="200" w:after="80" w:line="240" w:lineRule="auto"/>
+        <w:pBdr>
+          <w:bottom w:val="single" w:sz="12" w:space="1" w:color="2E3D50"/>
+        </w:pBdr>
+      </w:pPr>
+      <w:r>
+        <w:rPr>
+          <w:rFonts w:ascii="Times New Roman" w:hAnsi="Times New Roman" w:eastAsia="Times New Roman"/>
+          <w:b/>
+          <w:i w:val="0"/>
+          <w:color w:val="2E3D50"/>
+          <w:sz w:val="24"/>
+        </w:rPr>
+        <w:t>ÉDUCATION</w:t>
       </w:r>
     </w:p>
     <w:p>
@@ -475,20 +1176,28 @@
       </w:pPr>
       <w:r>
         <w:rPr>
-          <w:rFonts w:ascii="Calibri" w:hAnsi="Calibri" w:eastAsia="Calibri"/>
+          <w:rFonts w:ascii="Times New Roman" w:hAnsi="Times New Roman" w:eastAsia="Times New Roman"/>
           <w:b/>
-          <w:sz w:val="22"/>
+          <w:i w:val="0"/>
+          <w:color w:val="2E3D50"/>
+          <w:sz w:val="21"/>
         </w:rPr>
-        <w:t>Appart Ali</w:t>
+        <w:t>Master: Ingénierie des systèmes intelligents</w:t>
       </w:r>
+    </w:p>
+    <w:p>
+      <w:pPr>
+        <w:spacing w:before="0" w:after="40" w:line="240" w:lineRule="auto"/>
+      </w:pPr>
       <w:r>
         <w:rPr>
-          <w:rFonts w:ascii="Calibri" w:hAnsi="Calibri" w:eastAsia="Calibri"/>
+          <w:rFonts w:ascii="Times New Roman" w:hAnsi="Times New Roman" w:eastAsia="Times New Roman"/>
           <w:b w:val="0"/>
-          <w:color w:val="333333"/>
+          <w:i w:val="0"/>
+          <w:color w:val="2E3D50"/>
           <w:sz w:val="20"/>
         </w:rPr>
-        <w:t xml:space="preserve">  |  Next.js, Prisma | appartali.com — listings, Guesty API, AI assistant</w:t>
+        <w:t>Université Hassan 2 · Casablanca · 2026</w:t>
       </w:r>
     </w:p>
     <w:p>
@@ -497,140 +1206,63 @@
       </w:pPr>
       <w:r>
         <w:rPr>
-          <w:rFonts w:ascii="Calibri" w:hAnsi="Calibri" w:eastAsia="Calibri"/>
+          <w:rFonts w:ascii="Times New Roman" w:hAnsi="Times New Roman" w:eastAsia="Times New Roman"/>
           <w:b/>
-          <w:sz w:val="22"/>
+          <w:i w:val="0"/>
+          <w:color w:val="2E3D50"/>
+          <w:sz w:val="21"/>
         </w:rPr>
-        <w:t>Invoicr</w:t>
-      </w:r>
-      <w:r>
-        <w:rPr>
-          <w:rFonts w:ascii="Calibri" w:hAnsi="Calibri" w:eastAsia="Calibri"/>
-          <w:b w:val="0"/>
-          <w:color w:val="333333"/>
-          <w:sz w:val="20"/>
-        </w:rPr>
-        <w:t xml:space="preserve">  |  Next.js, Supabase | invoicrapp.com — invoice generation and management SaaS</w:t>
+        <w:t>Licence Fondamentale SMI</w:t>
       </w:r>
     </w:p>
     <w:p>
       <w:pPr>
-        <w:pStyle w:val="Heading2"/>
-        <w:spacing w:before="160" w:after="40" w:line="240" w:lineRule="auto"/>
-        <w:pBdr>
-          <w:bottom w:val="single" w:sz="12" w:space="1" w:color="222222"/>
-        </w:pBdr>
+        <w:spacing w:before="0" w:after="40" w:line="240" w:lineRule="auto"/>
       </w:pPr>
       <w:r>
         <w:rPr>
-          <w:rFonts w:ascii="Calibri" w:hAnsi="Calibri" w:eastAsia="Calibri"/>
-          <w:b/>
-          <w:color w:val="111111"/>
-          <w:sz w:val="23"/>
+          <w:rFonts w:ascii="Times New Roman" w:hAnsi="Times New Roman" w:eastAsia="Times New Roman"/>
+          <w:b w:val="0"/>
+          <w:i w:val="0"/>
+          <w:color w:val="2E3D50"/>
+          <w:sz w:val="20"/>
         </w:rPr>
-        <w:t>EDUCATION</w:t>
+        <w:t>Université Hassan 2 · Casablanca · 2024</w:t>
       </w:r>
     </w:p>
     <w:p>
       <w:pPr>
-        <w:spacing w:before="40" w:after="0" w:line="252" w:lineRule="auto"/>
+        <w:spacing w:before="60" w:after="0" w:line="252" w:lineRule="auto"/>
       </w:pPr>
       <w:r>
         <w:rPr>
-          <w:rFonts w:ascii="Calibri" w:hAnsi="Calibri" w:eastAsia="Calibri"/>
+          <w:rFonts w:ascii="Times New Roman" w:hAnsi="Times New Roman" w:eastAsia="Times New Roman"/>
           <w:b/>
+          <w:i w:val="0"/>
+          <w:color w:val="2E3D50"/>
           <w:sz w:val="21"/>
         </w:rPr>
-        <w:t>Master's in Intelligent Systems Engineering</w:t>
-      </w:r>
-      <w:r>
-        <w:rPr>
-          <w:rFonts w:ascii="Calibri" w:hAnsi="Calibri" w:eastAsia="Calibri"/>
-          <w:b w:val="0"/>
-          <w:color w:val="333333"/>
-          <w:sz w:val="20"/>
-        </w:rPr>
-        <w:t xml:space="preserve">  |  Faculty of Sciences Ain Chock, Hassan II University · Casablanca · 2024 – Present</w:t>
+        <w:t>DUT en Génie informatique</w:t>
       </w:r>
     </w:p>
     <w:p>
       <w:pPr>
-        <w:spacing w:before="40" w:after="0" w:line="252" w:lineRule="auto"/>
+        <w:spacing w:before="0" w:after="40" w:line="240" w:lineRule="auto"/>
       </w:pPr>
       <w:r>
         <w:rPr>
-          <w:rFonts w:ascii="Calibri" w:hAnsi="Calibri" w:eastAsia="Calibri"/>
-          <w:b/>
-          <w:sz w:val="21"/>
-        </w:rPr>
-        <w:t>Bachelor's in Mathematical and Computer Sciences (SMI)</w:t>
-      </w:r>
-      <w:r>
-        <w:rPr>
-          <w:rFonts w:ascii="Calibri" w:hAnsi="Calibri" w:eastAsia="Calibri"/>
+          <w:rFonts w:ascii="Times New Roman" w:hAnsi="Times New Roman" w:eastAsia="Times New Roman"/>
           <w:b w:val="0"/>
-          <w:color w:val="333333"/>
+          <w:i w:val="0"/>
+          <w:color w:val="2E3D50"/>
           <w:sz w:val="20"/>
         </w:rPr>
-        <w:t xml:space="preserve">  |  Faculty of Sciences Ain Chock, Hassan II University · Casablanca · 2023 – 2024</w:t>
-      </w:r>
-    </w:p>
-    <w:p>
-      <w:pPr>
-        <w:spacing w:before="40" w:after="0" w:line="252" w:lineRule="auto"/>
-      </w:pPr>
-      <w:r>
-        <w:rPr>
-          <w:rFonts w:ascii="Calibri" w:hAnsi="Calibri" w:eastAsia="Calibri"/>
-          <w:b/>
-          <w:sz w:val="21"/>
-        </w:rPr>
-        <w:t>University Diploma of Technology in Computer Engineering</w:t>
-      </w:r>
-      <w:r>
-        <w:rPr>
-          <w:rFonts w:ascii="Calibri" w:hAnsi="Calibri" w:eastAsia="Calibri"/>
-          <w:b w:val="0"/>
-          <w:color w:val="333333"/>
-          <w:sz w:val="20"/>
-        </w:rPr>
-        <w:t xml:space="preserve">  |  EST Safi, Cadi Ayyad University · Safi · 2021 – 2023</w:t>
-      </w:r>
-    </w:p>
-    <w:p>
-      <w:pPr>
-        <w:pStyle w:val="Heading2"/>
-        <w:spacing w:before="160" w:after="40" w:line="240" w:lineRule="auto"/>
-        <w:pBdr>
-          <w:bottom w:val="single" w:sz="12" w:space="1" w:color="222222"/>
-        </w:pBdr>
-      </w:pPr>
-      <w:r>
-        <w:rPr>
-          <w:rFonts w:ascii="Calibri" w:hAnsi="Calibri" w:eastAsia="Calibri"/>
-          <w:b/>
-          <w:color w:val="111111"/>
-          <w:sz w:val="23"/>
-        </w:rPr>
-        <w:t>LANGUAGES</w:t>
-      </w:r>
-    </w:p>
-    <w:p>
-      <w:pPr>
-        <w:spacing w:before="20" w:after="0" w:line="259" w:lineRule="auto"/>
-      </w:pPr>
-      <w:r>
-        <w:rPr>
-          <w:rFonts w:ascii="Calibri" w:hAnsi="Calibri" w:eastAsia="Calibri"/>
-          <w:b w:val="0"/>
-          <w:sz w:val="21"/>
-        </w:rPr>
-        <w:t>Arabic (Native) · French (Professional) · English (Professional)</w:t>
+        <w:t>Université Cadi Ayyad · Safi · 2021 - 2023</w:t>
       </w:r>
     </w:p>
     <w:sectPr>
       <w:pgSz w:w="11906" w:h="16838"/>
-      <w:pgMar w:top="567" w:right="794" w:bottom="567" w:left="794" w:header="720" w:footer="720" w:gutter="0"/>
+      <w:pgMar w:top="794" w:right="850" w:bottom="680" w:left="850" w:header="720" w:footer="720" w:gutter="0"/>
       <w:cols w:space="720"/>
       <w:docGrid w:linePitch="360"/>
     </w:sectPr>
@@ -1002,8 +1634,9 @@
     <w:qFormat/>
     <w:rsid w:val="00FC693F"/>
     <w:rPr>
-      <w:rFonts w:ascii="Calibri" w:hAnsi="Calibri" w:eastAsia="Calibri"/>
-      <w:sz w:val="21"/>
+      <w:rFonts w:ascii="Times New Roman" w:hAnsi="Times New Roman" w:eastAsia="Times New Roman"/>
+      <w:color w:val="2E3D50"/>
+      <w:sz w:val="20"/>
     </w:rPr>
   </w:style>
   <w:style w:type="paragraph" w:styleId="Header">
@@ -1085,15 +1718,15 @@
     <w:pPr>
       <w:keepNext/>
       <w:keepLines/>
-      <w:spacing w:before="160" w:after="40" w:line="240" w:lineRule="auto"/>
+      <w:spacing w:before="200" w:after="80"/>
       <w:outlineLvl w:val="1"/>
     </w:pPr>
     <w:rPr>
-      <w:rFonts w:asciiTheme="majorHAnsi" w:eastAsiaTheme="majorEastAsia" w:hAnsiTheme="majorHAnsi" w:cstheme="majorBidi" w:ascii="Calibri" w:hAnsi="Calibri"/>
+      <w:rFonts w:asciiTheme="majorHAnsi" w:eastAsiaTheme="majorEastAsia" w:hAnsiTheme="majorHAnsi" w:cstheme="majorBidi" w:ascii="Times New Roman" w:hAnsi="Times New Roman"/>
       <w:b/>
       <w:bCs/>
-      <w:color w:val="111111"/>
-      <w:sz w:val="23"/>
+      <w:color w:val="2E3D50"/>
+      <w:sz w:val="24"/>
       <w:szCs w:val="26"/>
     </w:rPr>
   </w:style>
@@ -1532,13 +2165,8 @@
       <w:numPr>
         <w:numId w:val="1"/>
       </w:numPr>
-      <w:spacing w:before="0" w:after="0"/>
       <w:contextualSpacing/>
     </w:pPr>
-    <w:rPr>
-      <w:rFonts w:ascii="Calibri" w:hAnsi="Calibri"/>
-      <w:sz w:val="21"/>
-    </w:rPr>
   </w:style>
   <w:style w:type="paragraph" w:styleId="ListBullet2">
     <w:name w:val="List Bullet 2"/>

</xml_diff>

<commit_message>
Tune resume typography: Merriweather, italic meta, black bullets
Switch the official layout to Merriweather, italicize company names and date/location, use smaller black bullets, and add space between experience and skill blocks.

Co-authored-by: JellYouness <JellYouness@users.noreply.github.com>
</commit_message>
<xml_diff>
--- a/resume/output/Youness-Jellouli.docx
+++ b/resume/output/Youness-Jellouli.docx
@@ -359,7 +359,7 @@
     </w:p>
     <w:p>
       <w:pPr>
-        <w:spacing w:before="140" w:after="0" w:line="252" w:lineRule="auto"/>
+        <w:spacing w:before="200" w:after="0" w:line="252" w:lineRule="auto"/>
       </w:pPr>
       <w:r>
         <w:rPr>
@@ -382,8 +382,8 @@
       <w:r>
         <w:rPr>
           <w:rFonts w:ascii="Times New Roman" w:hAnsi="Times New Roman" w:eastAsia="Times New Roman"/>
-          <w:b/>
-          <w:i w:val="0"/>
+          <w:b w:val="0"/>
+          <w:i/>
           <w:color w:val="2E3D50"/>
           <w:sz w:val="21"/>
         </w:rPr>
@@ -393,7 +393,7 @@
         <w:rPr>
           <w:rFonts w:ascii="Times New Roman" w:hAnsi="Times New Roman" w:eastAsia="Times New Roman"/>
           <w:b w:val="0"/>
-          <w:i w:val="0"/>
+          <w:i/>
           <w:color w:val="2E3D50"/>
           <w:sz w:val="20"/>
         </w:rPr>
@@ -457,7 +457,7 @@
     </w:p>
     <w:p>
       <w:pPr>
-        <w:spacing w:before="140" w:after="0" w:line="252" w:lineRule="auto"/>
+        <w:spacing w:before="200" w:after="0" w:line="252" w:lineRule="auto"/>
       </w:pPr>
       <w:r>
         <w:rPr>
@@ -480,8 +480,8 @@
       <w:r>
         <w:rPr>
           <w:rFonts w:ascii="Times New Roman" w:hAnsi="Times New Roman" w:eastAsia="Times New Roman"/>
-          <w:b/>
-          <w:i w:val="0"/>
+          <w:b w:val="0"/>
+          <w:i/>
           <w:color w:val="2E3D50"/>
           <w:sz w:val="21"/>
         </w:rPr>
@@ -491,7 +491,7 @@
         <w:rPr>
           <w:rFonts w:ascii="Times New Roman" w:hAnsi="Times New Roman" w:eastAsia="Times New Roman"/>
           <w:b w:val="0"/>
-          <w:i w:val="0"/>
+          <w:i/>
           <w:color w:val="2E3D50"/>
           <w:sz w:val="20"/>
         </w:rPr>
@@ -687,7 +687,7 @@
     </w:p>
     <w:p>
       <w:pPr>
-        <w:spacing w:before="140" w:after="0" w:line="252" w:lineRule="auto"/>
+        <w:spacing w:before="200" w:after="0" w:line="252" w:lineRule="auto"/>
       </w:pPr>
       <w:r>
         <w:rPr>
@@ -710,8 +710,8 @@
       <w:r>
         <w:rPr>
           <w:rFonts w:ascii="Times New Roman" w:hAnsi="Times New Roman" w:eastAsia="Times New Roman"/>
-          <w:b/>
-          <w:i w:val="0"/>
+          <w:b w:val="0"/>
+          <w:i/>
           <w:color w:val="2E3D50"/>
           <w:sz w:val="21"/>
         </w:rPr>
@@ -721,7 +721,7 @@
         <w:rPr>
           <w:rFonts w:ascii="Times New Roman" w:hAnsi="Times New Roman" w:eastAsia="Times New Roman"/>
           <w:b w:val="0"/>
-          <w:i w:val="0"/>
+          <w:i/>
           <w:color w:val="2E3D50"/>
           <w:sz w:val="20"/>
         </w:rPr>
@@ -799,7 +799,7 @@
     </w:p>
     <w:p>
       <w:pPr>
-        <w:spacing w:before="140" w:after="0" w:line="252" w:lineRule="auto"/>
+        <w:spacing w:before="200" w:after="0" w:line="252" w:lineRule="auto"/>
       </w:pPr>
       <w:r>
         <w:rPr>
@@ -822,8 +822,8 @@
       <w:r>
         <w:rPr>
           <w:rFonts w:ascii="Times New Roman" w:hAnsi="Times New Roman" w:eastAsia="Times New Roman"/>
-          <w:b/>
-          <w:i w:val="0"/>
+          <w:b w:val="0"/>
+          <w:i/>
           <w:color w:val="2E3D50"/>
           <w:sz w:val="21"/>
         </w:rPr>
@@ -833,7 +833,7 @@
         <w:rPr>
           <w:rFonts w:ascii="Times New Roman" w:hAnsi="Times New Roman" w:eastAsia="Times New Roman"/>
           <w:b w:val="0"/>
-          <w:i w:val="0"/>
+          <w:i/>
           <w:color w:val="2E3D50"/>
           <w:sz w:val="20"/>
         </w:rPr>
@@ -901,7 +901,7 @@
     </w:p>
     <w:p>
       <w:pPr>
-        <w:spacing w:before="140" w:after="0" w:line="252" w:lineRule="auto"/>
+        <w:spacing w:before="200" w:after="0" w:line="252" w:lineRule="auto"/>
       </w:pPr>
       <w:r>
         <w:rPr>
@@ -924,8 +924,8 @@
       <w:r>
         <w:rPr>
           <w:rFonts w:ascii="Times New Roman" w:hAnsi="Times New Roman" w:eastAsia="Times New Roman"/>
-          <w:b/>
-          <w:i w:val="0"/>
+          <w:b w:val="0"/>
+          <w:i/>
           <w:color w:val="2E3D50"/>
           <w:sz w:val="21"/>
         </w:rPr>
@@ -935,7 +935,7 @@
         <w:rPr>
           <w:rFonts w:ascii="Times New Roman" w:hAnsi="Times New Roman" w:eastAsia="Times New Roman"/>
           <w:b w:val="0"/>
-          <w:i w:val="0"/>
+          <w:i/>
           <w:color w:val="2E3D50"/>
           <w:sz w:val="20"/>
         </w:rPr>
@@ -979,7 +979,7 @@
     </w:p>
     <w:p>
       <w:pPr>
-        <w:spacing w:before="20" w:after="20" w:line="269" w:lineRule="auto"/>
+        <w:spacing w:before="60" w:after="60" w:line="269" w:lineRule="auto"/>
       </w:pPr>
       <w:r>
         <w:rPr>
@@ -1004,7 +1004,7 @@
     </w:p>
     <w:p>
       <w:pPr>
-        <w:spacing w:before="20" w:after="20" w:line="269" w:lineRule="auto"/>
+        <w:spacing w:before="60" w:after="60" w:line="269" w:lineRule="auto"/>
       </w:pPr>
       <w:r>
         <w:rPr>
@@ -1029,7 +1029,7 @@
     </w:p>
     <w:p>
       <w:pPr>
-        <w:spacing w:before="20" w:after="20" w:line="269" w:lineRule="auto"/>
+        <w:spacing w:before="60" w:after="60" w:line="269" w:lineRule="auto"/>
       </w:pPr>
       <w:r>
         <w:rPr>
@@ -1054,7 +1054,7 @@
     </w:p>
     <w:p>
       <w:pPr>
-        <w:spacing w:before="20" w:after="20" w:line="269" w:lineRule="auto"/>
+        <w:spacing w:before="60" w:after="60" w:line="269" w:lineRule="auto"/>
       </w:pPr>
       <w:r>
         <w:rPr>
@@ -1079,7 +1079,7 @@
     </w:p>
     <w:p>
       <w:pPr>
-        <w:spacing w:before="20" w:after="20" w:line="269" w:lineRule="auto"/>
+        <w:spacing w:before="60" w:after="60" w:line="269" w:lineRule="auto"/>
       </w:pPr>
       <w:r>
         <w:rPr>
@@ -1104,7 +1104,7 @@
     </w:p>
     <w:p>
       <w:pPr>
-        <w:spacing w:before="20" w:after="20" w:line="269" w:lineRule="auto"/>
+        <w:spacing w:before="60" w:after="60" w:line="269" w:lineRule="auto"/>
       </w:pPr>
       <w:r>
         <w:rPr>
@@ -1129,7 +1129,7 @@
     </w:p>
     <w:p>
       <w:pPr>
-        <w:spacing w:before="20" w:after="20" w:line="269" w:lineRule="auto"/>
+        <w:spacing w:before="60" w:after="60" w:line="269" w:lineRule="auto"/>
       </w:pPr>
       <w:r>
         <w:rPr>

</xml_diff>

<commit_message>
Set resume body text to 9px
Scale the official PDF/DOCX template so body copy, company/date lines, skills, and education use 9px (9pt in Word).

Co-authored-by: JellYouness <JellYouness@users.noreply.github.com>
</commit_message>
<xml_diff>
--- a/resume/output/Youness-Jellouli.docx
+++ b/resume/output/Youness-Jellouli.docx
@@ -150,7 +150,7 @@
           <w:b/>
           <w:i w:val="0"/>
           <w:color w:val="2E3D50"/>
-          <w:sz w:val="20"/>
+          <w:sz w:val="18"/>
         </w:rPr>
         <w:t>Développeur Full Stack</w:t>
       </w:r>
@@ -160,7 +160,7 @@
           <w:b w:val="0"/>
           <w:i w:val="0"/>
           <w:color w:val="2E3D50"/>
-          <w:sz w:val="20"/>
+          <w:sz w:val="18"/>
         </w:rPr>
         <w:t xml:space="preserve"> proactif avec </w:t>
       </w:r>
@@ -170,7 +170,7 @@
           <w:b/>
           <w:i w:val="0"/>
           <w:color w:val="2E3D50"/>
-          <w:sz w:val="20"/>
+          <w:sz w:val="18"/>
         </w:rPr>
         <w:t>+2 ans d'expérience</w:t>
       </w:r>
@@ -180,7 +180,7 @@
           <w:b w:val="0"/>
           <w:i w:val="0"/>
           <w:color w:val="2E3D50"/>
-          <w:sz w:val="20"/>
+          <w:sz w:val="18"/>
         </w:rPr>
         <w:t xml:space="preserve"> dans le développement d'applications web innovantes pour divers projets publics tels que </w:t>
       </w:r>
@@ -189,8 +189,8 @@
           <w:rPr>
             <w:color w:val="2B7FFF"/>
             <w:u w:val="single"/>
-            <w:sz w:val="20"/>
-            <w:szCs w:val="20"/>
+            <w:sz w:val="18"/>
+            <w:szCs w:val="18"/>
             <w:rFonts w:ascii="Times New Roman" w:hAnsi="Times New Roman"/>
           </w:rPr>
           <w:t xml:space="preserve">Wifina</w:t>
@@ -202,7 +202,7 @@
           <w:b w:val="0"/>
           <w:i w:val="0"/>
           <w:color w:val="2E3D50"/>
-          <w:sz w:val="20"/>
+          <w:sz w:val="18"/>
         </w:rPr>
         <w:t xml:space="preserve">, </w:t>
       </w:r>
@@ -211,8 +211,8 @@
           <w:rPr>
             <w:color w:val="2B7FFF"/>
             <w:u w:val="single"/>
-            <w:sz w:val="20"/>
-            <w:szCs w:val="20"/>
+            <w:sz w:val="18"/>
+            <w:szCs w:val="18"/>
             <w:rFonts w:ascii="Times New Roman" w:hAnsi="Times New Roman"/>
           </w:rPr>
           <w:t xml:space="preserve">IBC</w:t>
@@ -224,7 +224,7 @@
           <w:b w:val="0"/>
           <w:i w:val="0"/>
           <w:color w:val="2E3D50"/>
-          <w:sz w:val="20"/>
+          <w:sz w:val="18"/>
         </w:rPr>
         <w:t xml:space="preserve">, </w:t>
       </w:r>
@@ -233,8 +233,8 @@
           <w:rPr>
             <w:color w:val="2B7FFF"/>
             <w:u w:val="single"/>
-            <w:sz w:val="20"/>
-            <w:szCs w:val="20"/>
+            <w:sz w:val="18"/>
+            <w:szCs w:val="18"/>
             <w:rFonts w:ascii="Times New Roman" w:hAnsi="Times New Roman"/>
           </w:rPr>
           <w:t xml:space="preserve">oDoc</w:t>
@@ -246,7 +246,7 @@
           <w:b w:val="0"/>
           <w:i w:val="0"/>
           <w:color w:val="2E3D50"/>
-          <w:sz w:val="20"/>
+          <w:sz w:val="18"/>
         </w:rPr>
         <w:t xml:space="preserve">, </w:t>
       </w:r>
@@ -255,8 +255,8 @@
           <w:rPr>
             <w:color w:val="2B7FFF"/>
             <w:u w:val="single"/>
-            <w:sz w:val="20"/>
-            <w:szCs w:val="20"/>
+            <w:sz w:val="18"/>
+            <w:szCs w:val="18"/>
             <w:rFonts w:ascii="Times New Roman" w:hAnsi="Times New Roman"/>
           </w:rPr>
           <w:t xml:space="preserve">AppartAli</w:t>
@@ -268,7 +268,7 @@
           <w:b w:val="0"/>
           <w:i w:val="0"/>
           <w:color w:val="2E3D50"/>
-          <w:sz w:val="20"/>
+          <w:sz w:val="18"/>
         </w:rPr>
         <w:t xml:space="preserve">, </w:t>
       </w:r>
@@ -277,8 +277,8 @@
           <w:rPr>
             <w:color w:val="2B7FFF"/>
             <w:u w:val="single"/>
-            <w:sz w:val="20"/>
-            <w:szCs w:val="20"/>
+            <w:sz w:val="18"/>
+            <w:szCs w:val="18"/>
             <w:rFonts w:ascii="Times New Roman" w:hAnsi="Times New Roman"/>
           </w:rPr>
           <w:t xml:space="preserve">AVSM Club</w:t>
@@ -290,7 +290,7 @@
           <w:b w:val="0"/>
           <w:i w:val="0"/>
           <w:color w:val="2E3D50"/>
-          <w:sz w:val="20"/>
+          <w:sz w:val="18"/>
         </w:rPr>
         <w:t xml:space="preserve">, </w:t>
       </w:r>
@@ -299,8 +299,8 @@
           <w:rPr>
             <w:color w:val="2B7FFF"/>
             <w:u w:val="single"/>
-            <w:sz w:val="20"/>
-            <w:szCs w:val="20"/>
+            <w:sz w:val="18"/>
+            <w:szCs w:val="18"/>
             <w:rFonts w:ascii="Times New Roman" w:hAnsi="Times New Roman"/>
           </w:rPr>
           <w:t xml:space="preserve">Invoicr SaaS</w:t>
@@ -312,7 +312,7 @@
           <w:b w:val="0"/>
           <w:i w:val="0"/>
           <w:color w:val="2E3D50"/>
-          <w:sz w:val="20"/>
+          <w:sz w:val="18"/>
         </w:rPr>
         <w:t xml:space="preserve"> and </w:t>
       </w:r>
@@ -321,8 +321,8 @@
           <w:rPr>
             <w:color w:val="2B7FFF"/>
             <w:u w:val="single"/>
-            <w:sz w:val="20"/>
-            <w:szCs w:val="20"/>
+            <w:sz w:val="18"/>
+            <w:szCs w:val="18"/>
             <w:rFonts w:ascii="Times New Roman" w:hAnsi="Times New Roman"/>
           </w:rPr>
           <w:t xml:space="preserve">Allo Clients</w:t>
@@ -334,7 +334,7 @@
           <w:b w:val="0"/>
           <w:i w:val="0"/>
           <w:color w:val="2E3D50"/>
-          <w:sz w:val="20"/>
+          <w:sz w:val="18"/>
         </w:rPr>
         <w:t>. Pionnier des processus de développement de bout en bout, améliorant les performances des applications et l'engagement des utilisateurs grâce à une collaboration interfonctionnelle efficace. Recherche des opportunités pour tirer parti de son expertise en développement full stack afin de fournir des solutions de pointe et de favoriser l'avancement technologique.</w:t>
       </w:r>
@@ -385,7 +385,7 @@
           <w:b w:val="0"/>
           <w:i/>
           <w:color w:val="2E3D50"/>
-          <w:sz w:val="21"/>
+          <w:sz w:val="18"/>
         </w:rPr>
         <w:t>SBS Data Factory</w:t>
       </w:r>
@@ -395,7 +395,7 @@
           <w:b w:val="0"/>
           <w:i/>
           <w:color w:val="2E3D50"/>
-          <w:sz w:val="20"/>
+          <w:sz w:val="18"/>
         </w:rPr>
         <w:tab/>
         <w:t>Octobre 2025 - Présent, Casablanca, Maroc</w:t>
@@ -411,8 +411,8 @@
           <w:rPr>
             <w:color w:val="2B7FFF"/>
             <w:u w:val="single"/>
-            <w:sz w:val="20"/>
-            <w:szCs w:val="20"/>
+            <w:sz w:val="18"/>
+            <w:szCs w:val="18"/>
             <w:rFonts w:ascii="Times New Roman" w:hAnsi="Times New Roman"/>
           </w:rPr>
           <w:t xml:space="preserve">oDoc.ma</w:t>
@@ -424,7 +424,7 @@
           <w:b w:val="0"/>
           <w:i w:val="0"/>
           <w:color w:val="2E3D50"/>
-          <w:sz w:val="20"/>
+          <w:sz w:val="18"/>
         </w:rPr>
         <w:t xml:space="preserve"> - Travaillé sur une application web moderne de planification médicale et de gestion de profils, fournissant des composants réutilisables pour la disponibilité des médecins, la prise de rendez-vous et les profils des patients, avec une interface utilisateur claire et réactive.</w:t>
       </w:r>
@@ -440,7 +440,7 @@
           <w:b/>
           <w:i w:val="0"/>
           <w:color w:val="2E3D50"/>
-          <w:sz w:val="20"/>
+          <w:sz w:val="18"/>
         </w:rPr>
         <w:t>Tech:</w:t>
       </w:r>
@@ -450,7 +450,7 @@
           <w:b w:val="0"/>
           <w:i w:val="0"/>
           <w:color w:val="2E3D50"/>
-          <w:sz w:val="20"/>
+          <w:sz w:val="18"/>
         </w:rPr>
         <w:t xml:space="preserve"> Nextjs, React, TypeScript, Tailwind CSS, Shadcn-ui, Supabase, Nestjs, PostgreSQL.</w:t>
       </w:r>
@@ -483,7 +483,7 @@
           <w:b w:val="0"/>
           <w:i/>
           <w:color w:val="2E3D50"/>
-          <w:sz w:val="21"/>
+          <w:sz w:val="18"/>
         </w:rPr>
         <w:t>CyberScale</w:t>
       </w:r>
@@ -493,7 +493,7 @@
           <w:b w:val="0"/>
           <w:i/>
           <w:color w:val="2E3D50"/>
-          <w:sz w:val="20"/>
+          <w:sz w:val="18"/>
         </w:rPr>
         <w:tab/>
         <w:t>Juin 2024 - Juin 2025, France</w:t>
@@ -510,7 +510,7 @@
           <w:b w:val="0"/>
           <w:i w:val="0"/>
           <w:color w:val="2E3D50"/>
-          <w:sz w:val="20"/>
+          <w:sz w:val="18"/>
         </w:rPr>
         <w:t xml:space="preserve">Conception et maintenance d'applications web pour des projets publics, notamment </w:t>
       </w:r>
@@ -519,8 +519,8 @@
           <w:rPr>
             <w:color w:val="2B7FFF"/>
             <w:u w:val="single"/>
-            <w:sz w:val="20"/>
-            <w:szCs w:val="20"/>
+            <w:sz w:val="18"/>
+            <w:szCs w:val="18"/>
             <w:rFonts w:ascii="Times New Roman" w:hAnsi="Times New Roman"/>
           </w:rPr>
           <w:t xml:space="preserve">Wifina</w:t>
@@ -532,7 +532,7 @@
           <w:b w:val="0"/>
           <w:i w:val="0"/>
           <w:color w:val="2E3D50"/>
-          <w:sz w:val="20"/>
+          <w:sz w:val="18"/>
         </w:rPr>
         <w:t xml:space="preserve">, </w:t>
       </w:r>
@@ -541,8 +541,8 @@
           <w:rPr>
             <w:color w:val="2B7FFF"/>
             <w:u w:val="single"/>
-            <w:sz w:val="20"/>
-            <w:szCs w:val="20"/>
+            <w:sz w:val="18"/>
+            <w:szCs w:val="18"/>
             <w:rFonts w:ascii="Times New Roman" w:hAnsi="Times New Roman"/>
           </w:rPr>
           <w:t xml:space="preserve">IBC</w:t>
@@ -554,7 +554,7 @@
           <w:b w:val="0"/>
           <w:i w:val="0"/>
           <w:color w:val="2E3D50"/>
-          <w:sz w:val="20"/>
+          <w:sz w:val="18"/>
         </w:rPr>
         <w:t xml:space="preserve">, </w:t>
       </w:r>
@@ -563,8 +563,8 @@
           <w:rPr>
             <w:color w:val="2B7FFF"/>
             <w:u w:val="single"/>
-            <w:sz w:val="20"/>
-            <w:szCs w:val="20"/>
+            <w:sz w:val="18"/>
+            <w:szCs w:val="18"/>
             <w:rFonts w:ascii="Times New Roman" w:hAnsi="Times New Roman"/>
           </w:rPr>
           <w:t xml:space="preserve">Allo Reflexo</w:t>
@@ -576,7 +576,7 @@
           <w:b w:val="0"/>
           <w:i w:val="0"/>
           <w:color w:val="2E3D50"/>
-          <w:sz w:val="20"/>
+          <w:sz w:val="18"/>
         </w:rPr>
         <w:t xml:space="preserve">, and </w:t>
       </w:r>
@@ -585,8 +585,8 @@
           <w:rPr>
             <w:color w:val="2B7FFF"/>
             <w:u w:val="single"/>
-            <w:sz w:val="20"/>
-            <w:szCs w:val="20"/>
+            <w:sz w:val="18"/>
+            <w:szCs w:val="18"/>
             <w:rFonts w:ascii="Times New Roman" w:hAnsi="Times New Roman"/>
           </w:rPr>
           <w:t xml:space="preserve">CyberScale</w:t>
@@ -598,7 +598,7 @@
           <w:b w:val="0"/>
           <w:i w:val="0"/>
           <w:color w:val="2E3D50"/>
-          <w:sz w:val="20"/>
+          <w:sz w:val="18"/>
         </w:rPr>
         <w:t xml:space="preserve">, Desservant en moyenne </w:t>
       </w:r>
@@ -608,7 +608,7 @@
           <w:b/>
           <w:i w:val="0"/>
           <w:color w:val="2E3D50"/>
-          <w:sz w:val="20"/>
+          <w:sz w:val="18"/>
         </w:rPr>
         <w:t>+3 000</w:t>
       </w:r>
@@ -618,7 +618,7 @@
           <w:b w:val="0"/>
           <w:i w:val="0"/>
           <w:color w:val="2E3D50"/>
-          <w:sz w:val="20"/>
+          <w:sz w:val="18"/>
         </w:rPr>
         <w:t xml:space="preserve"> utilisateurs actifs par jour, ce qui témoigne d'une grande fiabilité.</w:t>
       </w:r>
@@ -634,7 +634,7 @@
           <w:b w:val="0"/>
           <w:i w:val="0"/>
           <w:color w:val="2E3D50"/>
-          <w:sz w:val="20"/>
+          <w:sz w:val="18"/>
         </w:rPr>
         <w:t xml:space="preserve">A orchestré la collaboration entre les équipes front-end, back-end et QA pour améliorer les performances des applications de </w:t>
       </w:r>
@@ -644,7 +644,7 @@
           <w:b/>
           <w:i w:val="0"/>
           <w:color w:val="2E3D50"/>
-          <w:sz w:val="20"/>
+          <w:sz w:val="18"/>
         </w:rPr>
         <w:t>25%</w:t>
       </w:r>
@@ -654,7 +654,7 @@
           <w:b w:val="0"/>
           <w:i w:val="0"/>
           <w:color w:val="2E3D50"/>
-          <w:sz w:val="20"/>
+          <w:sz w:val="18"/>
         </w:rPr>
         <w:t xml:space="preserve"> grâce à l'optimisation du code et à la rationalisation des processus de déploiement, tout en assurant l'évolutivité et les meilleures pratiques de codage.</w:t>
       </w:r>
@@ -670,7 +670,7 @@
           <w:b/>
           <w:i w:val="0"/>
           <w:color w:val="2E3D50"/>
-          <w:sz w:val="20"/>
+          <w:sz w:val="18"/>
         </w:rPr>
         <w:t>Tech:</w:t>
       </w:r>
@@ -680,7 +680,7 @@
           <w:b w:val="0"/>
           <w:i w:val="0"/>
           <w:color w:val="2E3D50"/>
-          <w:sz w:val="20"/>
+          <w:sz w:val="18"/>
         </w:rPr>
         <w:t xml:space="preserve"> Nextjs, React, Typescript, MaterialUI, Laravel, Nodejs, Expressjs, MySQL.</w:t>
       </w:r>
@@ -713,7 +713,7 @@
           <w:b w:val="0"/>
           <w:i/>
           <w:color w:val="2E3D50"/>
-          <w:sz w:val="21"/>
+          <w:sz w:val="18"/>
         </w:rPr>
         <w:t>CBI</w:t>
       </w:r>
@@ -723,7 +723,7 @@
           <w:b w:val="0"/>
           <w:i/>
           <w:color w:val="2E3D50"/>
-          <w:sz w:val="20"/>
+          <w:sz w:val="18"/>
         </w:rPr>
         <w:tab/>
         <w:t>Septembre 2023 - Janvier 2024, Casablanca, Morocco</w:t>
@@ -740,7 +740,7 @@
           <w:b w:val="0"/>
           <w:i w:val="0"/>
           <w:color w:val="2E3D50"/>
-          <w:sz w:val="20"/>
+          <w:sz w:val="18"/>
         </w:rPr>
         <w:t xml:space="preserve">A assisté aux activités de pré-vente et a fourni un support dans la création d'offres Microsoft pour </w:t>
       </w:r>
@@ -750,7 +750,7 @@
           <w:b/>
           <w:i w:val="0"/>
           <w:color w:val="2E3D50"/>
-          <w:sz w:val="20"/>
+          <w:sz w:val="18"/>
         </w:rPr>
         <w:t>+100</w:t>
       </w:r>
@@ -760,7 +760,7 @@
           <w:b w:val="0"/>
           <w:i w:val="0"/>
           <w:color w:val="2E3D50"/>
-          <w:sz w:val="20"/>
+          <w:sz w:val="18"/>
         </w:rPr>
         <w:t xml:space="preserve"> clients.</w:t>
       </w:r>
@@ -776,7 +776,7 @@
           <w:b w:val="0"/>
           <w:i w:val="0"/>
           <w:color w:val="2E3D50"/>
-          <w:sz w:val="20"/>
+          <w:sz w:val="18"/>
         </w:rPr>
         <w:t>A géré les abonnements Microsoft via MWP (Microsoft Subscription Management - CSP), aidant les clients à optimiser leurs solutions cloud.</w:t>
       </w:r>
@@ -792,7 +792,7 @@
           <w:b w:val="0"/>
           <w:i w:val="0"/>
           <w:color w:val="2E3D50"/>
-          <w:sz w:val="20"/>
+          <w:sz w:val="18"/>
         </w:rPr>
         <w:t>A collaboré avec les clients pour comprendre les besoins et a fourni des solutions cloud Microsoft et améliorer leurs opérations commerciales.</w:t>
       </w:r>
@@ -825,7 +825,7 @@
           <w:b w:val="0"/>
           <w:i/>
           <w:color w:val="2E3D50"/>
-          <w:sz w:val="21"/>
+          <w:sz w:val="18"/>
         </w:rPr>
         <w:t>IS-TECH</w:t>
       </w:r>
@@ -835,7 +835,7 @@
           <w:b w:val="0"/>
           <w:i/>
           <w:color w:val="2E3D50"/>
-          <w:sz w:val="20"/>
+          <w:sz w:val="18"/>
         </w:rPr>
         <w:tab/>
         <w:t>Juillet 2023 - Novembre 2023, Casablanca, Morocco</w:t>
@@ -852,7 +852,7 @@
           <w:b w:val="0"/>
           <w:i w:val="0"/>
           <w:color w:val="2E3D50"/>
-          <w:sz w:val="20"/>
+          <w:sz w:val="18"/>
         </w:rPr>
         <w:t>A conçu et développé des applications web interactives.</w:t>
       </w:r>
@@ -868,7 +868,7 @@
           <w:b w:val="0"/>
           <w:i w:val="0"/>
           <w:color w:val="2E3D50"/>
-          <w:sz w:val="20"/>
+          <w:sz w:val="18"/>
         </w:rPr>
         <w:t>A intégré des API RESTful pour étendre les fonctionnalités de l'application principale, améliorant l'expérience utilisateur et rationalisant le flux de données à travers plusieurs modules.</w:t>
       </w:r>
@@ -884,7 +884,7 @@
           <w:b/>
           <w:i w:val="0"/>
           <w:color w:val="2E3D50"/>
-          <w:sz w:val="20"/>
+          <w:sz w:val="18"/>
         </w:rPr>
         <w:t>Tech:</w:t>
       </w:r>
@@ -894,7 +894,7 @@
           <w:b w:val="0"/>
           <w:i w:val="0"/>
           <w:color w:val="2E3D50"/>
-          <w:sz w:val="20"/>
+          <w:sz w:val="18"/>
         </w:rPr>
         <w:t xml:space="preserve"> React, Javascript, MaterialUI, Redux, Laravel, MySQL.</w:t>
       </w:r>
@@ -927,7 +927,7 @@
           <w:b w:val="0"/>
           <w:i/>
           <w:color w:val="2E3D50"/>
-          <w:sz w:val="21"/>
+          <w:sz w:val="18"/>
         </w:rPr>
         <w:t>Palmeraie Country Club</w:t>
       </w:r>
@@ -937,7 +937,7 @@
           <w:b w:val="0"/>
           <w:i/>
           <w:color w:val="2E3D50"/>
-          <w:sz w:val="20"/>
+          <w:sz w:val="18"/>
         </w:rPr>
         <w:tab/>
         <w:t>Juillet 2022 - Septembre 2022, Casablanca, Morocco</w:t>
@@ -954,7 +954,7 @@
           <w:b w:val="0"/>
           <w:i w:val="0"/>
           <w:color w:val="2E3D50"/>
-          <w:sz w:val="20"/>
+          <w:sz w:val="18"/>
         </w:rPr>
         <w:t>A conçu et développé une application web pour la gestion des adhésions et des abonnements utilisant HTML, CSS, JavaScript, PHP et MySQL.</w:t>
       </w:r>
@@ -987,7 +987,7 @@
           <w:b/>
           <w:i w:val="0"/>
           <w:color w:val="2E3D50"/>
-          <w:sz w:val="20"/>
+          <w:sz w:val="18"/>
         </w:rPr>
         <w:t xml:space="preserve">Langages de programmation: </w:t>
       </w:r>
@@ -997,7 +997,7 @@
           <w:b w:val="0"/>
           <w:i w:val="0"/>
           <w:color w:val="2E3D50"/>
-          <w:sz w:val="20"/>
+          <w:sz w:val="18"/>
         </w:rPr>
         <w:t>JavaScript, TypeScript, PHP, Python, Java, C/C++</w:t>
       </w:r>
@@ -1012,7 +1012,7 @@
           <w:b/>
           <w:i w:val="0"/>
           <w:color w:val="2E3D50"/>
-          <w:sz w:val="20"/>
+          <w:sz w:val="18"/>
         </w:rPr>
         <w:t xml:space="preserve">Frontend/ Backend: </w:t>
       </w:r>
@@ -1022,7 +1022,7 @@
           <w:b w:val="0"/>
           <w:i w:val="0"/>
           <w:color w:val="2E3D50"/>
-          <w:sz w:val="20"/>
+          <w:sz w:val="18"/>
         </w:rPr>
         <w:t>React.js, Next.js, Express, Node.js, Laravel</w:t>
       </w:r>
@@ -1037,7 +1037,7 @@
           <w:b/>
           <w:i w:val="0"/>
           <w:color w:val="2E3D50"/>
-          <w:sz w:val="20"/>
+          <w:sz w:val="18"/>
         </w:rPr>
         <w:t xml:space="preserve">Services Cloud: </w:t>
       </w:r>
@@ -1047,7 +1047,7 @@
           <w:b w:val="0"/>
           <w:i w:val="0"/>
           <w:color w:val="2E3D50"/>
-          <w:sz w:val="20"/>
+          <w:sz w:val="18"/>
         </w:rPr>
         <w:t>Google Cloud, Vercel, Cloudflare</w:t>
       </w:r>
@@ -1062,7 +1062,7 @@
           <w:b/>
           <w:i w:val="0"/>
           <w:color w:val="2E3D50"/>
-          <w:sz w:val="20"/>
+          <w:sz w:val="18"/>
         </w:rPr>
         <w:t xml:space="preserve">Database: </w:t>
       </w:r>
@@ -1072,7 +1072,7 @@
           <w:b w:val="0"/>
           <w:i w:val="0"/>
           <w:color w:val="2E3D50"/>
-          <w:sz w:val="20"/>
+          <w:sz w:val="18"/>
         </w:rPr>
         <w:t>MySQL, PostgreSQL, Supabase, MongoDB</w:t>
       </w:r>
@@ -1087,7 +1087,7 @@
           <w:b/>
           <w:i w:val="0"/>
           <w:color w:val="2E3D50"/>
-          <w:sz w:val="20"/>
+          <w:sz w:val="18"/>
         </w:rPr>
         <w:t xml:space="preserve">Intelligence Artificiel/ AI: </w:t>
       </w:r>
@@ -1097,7 +1097,7 @@
           <w:b w:val="0"/>
           <w:i w:val="0"/>
           <w:color w:val="2E3D50"/>
-          <w:sz w:val="20"/>
+          <w:sz w:val="18"/>
         </w:rPr>
         <w:t>OpenAI API, Claude, Cursor, Copilot, DeepSeek, Ollama, n8n</w:t>
       </w:r>
@@ -1112,7 +1112,7 @@
           <w:b/>
           <w:i w:val="0"/>
           <w:color w:val="2E3D50"/>
-          <w:sz w:val="20"/>
+          <w:sz w:val="18"/>
         </w:rPr>
         <w:t xml:space="preserve">Méthodologies: </w:t>
       </w:r>
@@ -1122,7 +1122,7 @@
           <w:b w:val="0"/>
           <w:i w:val="0"/>
           <w:color w:val="2E3D50"/>
-          <w:sz w:val="20"/>
+          <w:sz w:val="18"/>
         </w:rPr>
         <w:t>Agile, Scrum, Kanban, Design Pattern, Web Architecture</w:t>
       </w:r>
@@ -1137,7 +1137,7 @@
           <w:b/>
           <w:i w:val="0"/>
           <w:color w:val="2E3D50"/>
-          <w:sz w:val="20"/>
+          <w:sz w:val="18"/>
         </w:rPr>
         <w:t xml:space="preserve">Soft Skills: </w:t>
       </w:r>
@@ -1147,7 +1147,7 @@
           <w:b w:val="0"/>
           <w:i w:val="0"/>
           <w:color w:val="2E3D50"/>
-          <w:sz w:val="20"/>
+          <w:sz w:val="18"/>
         </w:rPr>
         <w:t>Communication, collaboration en équipe, résolution de problèmes, gestion du temps, adaptabilité</w:t>
       </w:r>
@@ -1180,7 +1180,7 @@
           <w:b/>
           <w:i w:val="0"/>
           <w:color w:val="2E3D50"/>
-          <w:sz w:val="21"/>
+          <w:sz w:val="18"/>
         </w:rPr>
         <w:t>Master: Ingénierie des systèmes intelligents</w:t>
       </w:r>
@@ -1195,7 +1195,7 @@
           <w:b w:val="0"/>
           <w:i w:val="0"/>
           <w:color w:val="2E3D50"/>
-          <w:sz w:val="20"/>
+          <w:sz w:val="18"/>
         </w:rPr>
         <w:t>Université Hassan 2 · Casablanca · 2026</w:t>
       </w:r>
@@ -1210,7 +1210,7 @@
           <w:b/>
           <w:i w:val="0"/>
           <w:color w:val="2E3D50"/>
-          <w:sz w:val="21"/>
+          <w:sz w:val="18"/>
         </w:rPr>
         <w:t>Licence Fondamentale SMI</w:t>
       </w:r>
@@ -1225,7 +1225,7 @@
           <w:b w:val="0"/>
           <w:i w:val="0"/>
           <w:color w:val="2E3D50"/>
-          <w:sz w:val="20"/>
+          <w:sz w:val="18"/>
         </w:rPr>
         <w:t>Université Hassan 2 · Casablanca · 2024</w:t>
       </w:r>
@@ -1240,7 +1240,7 @@
           <w:b/>
           <w:i w:val="0"/>
           <w:color w:val="2E3D50"/>
-          <w:sz w:val="21"/>
+          <w:sz w:val="18"/>
         </w:rPr>
         <w:t>DUT en Génie informatique</w:t>
       </w:r>
@@ -1255,7 +1255,7 @@
           <w:b w:val="0"/>
           <w:i w:val="0"/>
           <w:color w:val="2E3D50"/>
-          <w:sz w:val="20"/>
+          <w:sz w:val="18"/>
         </w:rPr>
         <w:t>Université Cadi Ayyad · Safi · 2021 - 2023</w:t>
       </w:r>
@@ -1636,7 +1636,7 @@
     <w:rPr>
       <w:rFonts w:ascii="Times New Roman" w:hAnsi="Times New Roman" w:eastAsia="Times New Roman"/>
       <w:color w:val="2E3D50"/>
-      <w:sz w:val="20"/>
+      <w:sz w:val="18"/>
     </w:rPr>
   </w:style>
   <w:style w:type="paragraph" w:styleId="Header">

</xml_diff>

<commit_message>
Set resume type to 10px and add block spacing
Increase body text to 10px, widen word spacing, and add more space between experience, skill, and section blocks while staying on one page.

Co-authored-by: JellYouness <JellYouness@users.noreply.github.com>
</commit_message>
<xml_diff>
--- a/resume/output/Youness-Jellouli.docx
+++ b/resume/output/Youness-Jellouli.docx
@@ -29,7 +29,7 @@
           <w:b w:val="0"/>
           <w:i w:val="0"/>
           <w:color w:val="2E3D50"/>
-          <w:sz w:val="18"/>
+          <w:sz w:val="20"/>
         </w:rPr>
         <w:t>Casablanca, Morocco</w:t>
       </w:r>
@@ -39,7 +39,7 @@
           <w:b w:val="0"/>
           <w:i w:val="0"/>
           <w:color w:val="2E3D50"/>
-          <w:sz w:val="18"/>
+          <w:sz w:val="20"/>
         </w:rPr>
         <w:t xml:space="preserve">   </w:t>
       </w:r>
@@ -48,8 +48,8 @@
           <w:rPr>
             <w:color w:val="2B7FFF"/>
             <w:u w:val="single"/>
-            <w:sz w:val="18"/>
-            <w:szCs w:val="18"/>
+            <w:sz w:val="20"/>
+            <w:szCs w:val="20"/>
             <w:rFonts w:ascii="Times New Roman" w:hAnsi="Times New Roman"/>
           </w:rPr>
           <w:t xml:space="preserve">younessjellouli12@gmail.com</w:t>
@@ -61,7 +61,7 @@
           <w:b w:val="0"/>
           <w:i w:val="0"/>
           <w:color w:val="2E3D50"/>
-          <w:sz w:val="18"/>
+          <w:sz w:val="20"/>
         </w:rPr>
         <w:t xml:space="preserve">   </w:t>
       </w:r>
@@ -70,8 +70,8 @@
           <w:rPr>
             <w:color w:val="2B7FFF"/>
             <w:u w:val="single"/>
-            <w:sz w:val="18"/>
-            <w:szCs w:val="18"/>
+            <w:sz w:val="20"/>
+            <w:szCs w:val="20"/>
             <w:rFonts w:ascii="Times New Roman" w:hAnsi="Times New Roman"/>
           </w:rPr>
           <w:t xml:space="preserve">(+212)627-594239</w:t>
@@ -83,7 +83,7 @@
           <w:b w:val="0"/>
           <w:i w:val="0"/>
           <w:color w:val="2E3D50"/>
-          <w:sz w:val="18"/>
+          <w:sz w:val="20"/>
         </w:rPr>
         <w:t xml:space="preserve">   </w:t>
       </w:r>
@@ -92,8 +92,8 @@
           <w:rPr>
             <w:color w:val="2B7FFF"/>
             <w:u w:val="single"/>
-            <w:sz w:val="18"/>
-            <w:szCs w:val="18"/>
+            <w:sz w:val="20"/>
+            <w:szCs w:val="20"/>
             <w:rFonts w:ascii="Times New Roman" w:hAnsi="Times New Roman"/>
           </w:rPr>
           <w:t xml:space="preserve">in/youness-jellouli</w:t>
@@ -105,7 +105,7 @@
           <w:b w:val="0"/>
           <w:i w:val="0"/>
           <w:color w:val="2E3D50"/>
-          <w:sz w:val="18"/>
+          <w:sz w:val="20"/>
         </w:rPr>
         <w:t xml:space="preserve">   </w:t>
       </w:r>
@@ -114,8 +114,8 @@
           <w:rPr>
             <w:color w:val="2B7FFF"/>
             <w:u w:val="single"/>
-            <w:sz w:val="18"/>
-            <w:szCs w:val="18"/>
+            <w:sz w:val="20"/>
+            <w:szCs w:val="20"/>
             <w:rFonts w:ascii="Times New Roman" w:hAnsi="Times New Roman"/>
           </w:rPr>
           <w:t xml:space="preserve">jellyouness.com</w:t>
@@ -150,7 +150,7 @@
           <w:b/>
           <w:i w:val="0"/>
           <w:color w:val="2E3D50"/>
-          <w:sz w:val="18"/>
+          <w:sz w:val="20"/>
         </w:rPr>
         <w:t>Développeur Full Stack</w:t>
       </w:r>
@@ -160,7 +160,7 @@
           <w:b w:val="0"/>
           <w:i w:val="0"/>
           <w:color w:val="2E3D50"/>
-          <w:sz w:val="18"/>
+          <w:sz w:val="20"/>
         </w:rPr>
         <w:t xml:space="preserve"> proactif avec </w:t>
       </w:r>
@@ -170,7 +170,7 @@
           <w:b/>
           <w:i w:val="0"/>
           <w:color w:val="2E3D50"/>
-          <w:sz w:val="18"/>
+          <w:sz w:val="20"/>
         </w:rPr>
         <w:t>+2 ans d'expérience</w:t>
       </w:r>
@@ -180,7 +180,7 @@
           <w:b w:val="0"/>
           <w:i w:val="0"/>
           <w:color w:val="2E3D50"/>
-          <w:sz w:val="18"/>
+          <w:sz w:val="20"/>
         </w:rPr>
         <w:t xml:space="preserve"> dans le développement d'applications web innovantes pour divers projets publics tels que </w:t>
       </w:r>
@@ -189,8 +189,8 @@
           <w:rPr>
             <w:color w:val="2B7FFF"/>
             <w:u w:val="single"/>
-            <w:sz w:val="18"/>
-            <w:szCs w:val="18"/>
+            <w:sz w:val="20"/>
+            <w:szCs w:val="20"/>
             <w:rFonts w:ascii="Times New Roman" w:hAnsi="Times New Roman"/>
           </w:rPr>
           <w:t xml:space="preserve">Wifina</w:t>
@@ -202,7 +202,7 @@
           <w:b w:val="0"/>
           <w:i w:val="0"/>
           <w:color w:val="2E3D50"/>
-          <w:sz w:val="18"/>
+          <w:sz w:val="20"/>
         </w:rPr>
         <w:t xml:space="preserve">, </w:t>
       </w:r>
@@ -211,8 +211,8 @@
           <w:rPr>
             <w:color w:val="2B7FFF"/>
             <w:u w:val="single"/>
-            <w:sz w:val="18"/>
-            <w:szCs w:val="18"/>
+            <w:sz w:val="20"/>
+            <w:szCs w:val="20"/>
             <w:rFonts w:ascii="Times New Roman" w:hAnsi="Times New Roman"/>
           </w:rPr>
           <w:t xml:space="preserve">IBC</w:t>
@@ -224,7 +224,7 @@
           <w:b w:val="0"/>
           <w:i w:val="0"/>
           <w:color w:val="2E3D50"/>
-          <w:sz w:val="18"/>
+          <w:sz w:val="20"/>
         </w:rPr>
         <w:t xml:space="preserve">, </w:t>
       </w:r>
@@ -233,8 +233,8 @@
           <w:rPr>
             <w:color w:val="2B7FFF"/>
             <w:u w:val="single"/>
-            <w:sz w:val="18"/>
-            <w:szCs w:val="18"/>
+            <w:sz w:val="20"/>
+            <w:szCs w:val="20"/>
             <w:rFonts w:ascii="Times New Roman" w:hAnsi="Times New Roman"/>
           </w:rPr>
           <w:t xml:space="preserve">oDoc</w:t>
@@ -246,7 +246,7 @@
           <w:b w:val="0"/>
           <w:i w:val="0"/>
           <w:color w:val="2E3D50"/>
-          <w:sz w:val="18"/>
+          <w:sz w:val="20"/>
         </w:rPr>
         <w:t xml:space="preserve">, </w:t>
       </w:r>
@@ -255,8 +255,8 @@
           <w:rPr>
             <w:color w:val="2B7FFF"/>
             <w:u w:val="single"/>
-            <w:sz w:val="18"/>
-            <w:szCs w:val="18"/>
+            <w:sz w:val="20"/>
+            <w:szCs w:val="20"/>
             <w:rFonts w:ascii="Times New Roman" w:hAnsi="Times New Roman"/>
           </w:rPr>
           <w:t xml:space="preserve">AppartAli</w:t>
@@ -268,7 +268,7 @@
           <w:b w:val="0"/>
           <w:i w:val="0"/>
           <w:color w:val="2E3D50"/>
-          <w:sz w:val="18"/>
+          <w:sz w:val="20"/>
         </w:rPr>
         <w:t xml:space="preserve">, </w:t>
       </w:r>
@@ -277,8 +277,8 @@
           <w:rPr>
             <w:color w:val="2B7FFF"/>
             <w:u w:val="single"/>
-            <w:sz w:val="18"/>
-            <w:szCs w:val="18"/>
+            <w:sz w:val="20"/>
+            <w:szCs w:val="20"/>
             <w:rFonts w:ascii="Times New Roman" w:hAnsi="Times New Roman"/>
           </w:rPr>
           <w:t xml:space="preserve">AVSM Club</w:t>
@@ -290,7 +290,7 @@
           <w:b w:val="0"/>
           <w:i w:val="0"/>
           <w:color w:val="2E3D50"/>
-          <w:sz w:val="18"/>
+          <w:sz w:val="20"/>
         </w:rPr>
         <w:t xml:space="preserve">, </w:t>
       </w:r>
@@ -299,8 +299,8 @@
           <w:rPr>
             <w:color w:val="2B7FFF"/>
             <w:u w:val="single"/>
-            <w:sz w:val="18"/>
-            <w:szCs w:val="18"/>
+            <w:sz w:val="20"/>
+            <w:szCs w:val="20"/>
             <w:rFonts w:ascii="Times New Roman" w:hAnsi="Times New Roman"/>
           </w:rPr>
           <w:t xml:space="preserve">Invoicr SaaS</w:t>
@@ -312,7 +312,7 @@
           <w:b w:val="0"/>
           <w:i w:val="0"/>
           <w:color w:val="2E3D50"/>
-          <w:sz w:val="18"/>
+          <w:sz w:val="20"/>
         </w:rPr>
         <w:t xml:space="preserve"> and </w:t>
       </w:r>
@@ -321,8 +321,8 @@
           <w:rPr>
             <w:color w:val="2B7FFF"/>
             <w:u w:val="single"/>
-            <w:sz w:val="18"/>
-            <w:szCs w:val="18"/>
+            <w:sz w:val="20"/>
+            <w:szCs w:val="20"/>
             <w:rFonts w:ascii="Times New Roman" w:hAnsi="Times New Roman"/>
           </w:rPr>
           <w:t xml:space="preserve">Allo Clients</w:t>
@@ -334,7 +334,7 @@
           <w:b w:val="0"/>
           <w:i w:val="0"/>
           <w:color w:val="2E3D50"/>
-          <w:sz w:val="18"/>
+          <w:sz w:val="20"/>
         </w:rPr>
         <w:t>. Pionnier des processus de développement de bout en bout, améliorant les performances des applications et l'engagement des utilisateurs grâce à une collaboration interfonctionnelle efficace. Recherche des opportunités pour tirer parti de son expertise en développement full stack afin de fournir des solutions de pointe et de favoriser l'avancement technologique.</w:t>
       </w:r>
@@ -359,7 +359,7 @@
     </w:p>
     <w:p>
       <w:pPr>
-        <w:spacing w:before="200" w:after="0" w:line="252" w:lineRule="auto"/>
+        <w:spacing w:before="280" w:after="0" w:line="252" w:lineRule="auto"/>
       </w:pPr>
       <w:r>
         <w:rPr>
@@ -385,7 +385,7 @@
           <w:b w:val="0"/>
           <w:i/>
           <w:color w:val="2E3D50"/>
-          <w:sz w:val="18"/>
+          <w:sz w:val="20"/>
         </w:rPr>
         <w:t>SBS Data Factory</w:t>
       </w:r>
@@ -395,7 +395,7 @@
           <w:b w:val="0"/>
           <w:i/>
           <w:color w:val="2E3D50"/>
-          <w:sz w:val="18"/>
+          <w:sz w:val="20"/>
         </w:rPr>
         <w:tab/>
         <w:t>Octobre 2025 - Présent, Casablanca, Maroc</w:t>
@@ -411,8 +411,8 @@
           <w:rPr>
             <w:color w:val="2B7FFF"/>
             <w:u w:val="single"/>
-            <w:sz w:val="18"/>
-            <w:szCs w:val="18"/>
+            <w:sz w:val="20"/>
+            <w:szCs w:val="20"/>
             <w:rFonts w:ascii="Times New Roman" w:hAnsi="Times New Roman"/>
           </w:rPr>
           <w:t xml:space="preserve">oDoc.ma</w:t>
@@ -424,7 +424,7 @@
           <w:b w:val="0"/>
           <w:i w:val="0"/>
           <w:color w:val="2E3D50"/>
-          <w:sz w:val="18"/>
+          <w:sz w:val="20"/>
         </w:rPr>
         <w:t xml:space="preserve"> - Travaillé sur une application web moderne de planification médicale et de gestion de profils, fournissant des composants réutilisables pour la disponibilité des médecins, la prise de rendez-vous et les profils des patients, avec une interface utilisateur claire et réactive.</w:t>
       </w:r>
@@ -440,7 +440,7 @@
           <w:b/>
           <w:i w:val="0"/>
           <w:color w:val="2E3D50"/>
-          <w:sz w:val="18"/>
+          <w:sz w:val="20"/>
         </w:rPr>
         <w:t>Tech:</w:t>
       </w:r>
@@ -450,14 +450,14 @@
           <w:b w:val="0"/>
           <w:i w:val="0"/>
           <w:color w:val="2E3D50"/>
-          <w:sz w:val="18"/>
+          <w:sz w:val="20"/>
         </w:rPr>
         <w:t xml:space="preserve"> Nextjs, React, TypeScript, Tailwind CSS, Shadcn-ui, Supabase, Nestjs, PostgreSQL.</w:t>
       </w:r>
     </w:p>
     <w:p>
       <w:pPr>
-        <w:spacing w:before="200" w:after="0" w:line="252" w:lineRule="auto"/>
+        <w:spacing w:before="280" w:after="0" w:line="252" w:lineRule="auto"/>
       </w:pPr>
       <w:r>
         <w:rPr>
@@ -483,7 +483,7 @@
           <w:b w:val="0"/>
           <w:i/>
           <w:color w:val="2E3D50"/>
-          <w:sz w:val="18"/>
+          <w:sz w:val="20"/>
         </w:rPr>
         <w:t>CyberScale</w:t>
       </w:r>
@@ -493,7 +493,7 @@
           <w:b w:val="0"/>
           <w:i/>
           <w:color w:val="2E3D50"/>
-          <w:sz w:val="18"/>
+          <w:sz w:val="20"/>
         </w:rPr>
         <w:tab/>
         <w:t>Juin 2024 - Juin 2025, France</w:t>
@@ -510,7 +510,7 @@
           <w:b w:val="0"/>
           <w:i w:val="0"/>
           <w:color w:val="2E3D50"/>
-          <w:sz w:val="18"/>
+          <w:sz w:val="20"/>
         </w:rPr>
         <w:t xml:space="preserve">Conception et maintenance d'applications web pour des projets publics, notamment </w:t>
       </w:r>
@@ -519,8 +519,8 @@
           <w:rPr>
             <w:color w:val="2B7FFF"/>
             <w:u w:val="single"/>
-            <w:sz w:val="18"/>
-            <w:szCs w:val="18"/>
+            <w:sz w:val="20"/>
+            <w:szCs w:val="20"/>
             <w:rFonts w:ascii="Times New Roman" w:hAnsi="Times New Roman"/>
           </w:rPr>
           <w:t xml:space="preserve">Wifina</w:t>
@@ -532,7 +532,7 @@
           <w:b w:val="0"/>
           <w:i w:val="0"/>
           <w:color w:val="2E3D50"/>
-          <w:sz w:val="18"/>
+          <w:sz w:val="20"/>
         </w:rPr>
         <w:t xml:space="preserve">, </w:t>
       </w:r>
@@ -541,8 +541,8 @@
           <w:rPr>
             <w:color w:val="2B7FFF"/>
             <w:u w:val="single"/>
-            <w:sz w:val="18"/>
-            <w:szCs w:val="18"/>
+            <w:sz w:val="20"/>
+            <w:szCs w:val="20"/>
             <w:rFonts w:ascii="Times New Roman" w:hAnsi="Times New Roman"/>
           </w:rPr>
           <w:t xml:space="preserve">IBC</w:t>
@@ -554,7 +554,7 @@
           <w:b w:val="0"/>
           <w:i w:val="0"/>
           <w:color w:val="2E3D50"/>
-          <w:sz w:val="18"/>
+          <w:sz w:val="20"/>
         </w:rPr>
         <w:t xml:space="preserve">, </w:t>
       </w:r>
@@ -563,8 +563,8 @@
           <w:rPr>
             <w:color w:val="2B7FFF"/>
             <w:u w:val="single"/>
-            <w:sz w:val="18"/>
-            <w:szCs w:val="18"/>
+            <w:sz w:val="20"/>
+            <w:szCs w:val="20"/>
             <w:rFonts w:ascii="Times New Roman" w:hAnsi="Times New Roman"/>
           </w:rPr>
           <w:t xml:space="preserve">Allo Reflexo</w:t>
@@ -576,7 +576,7 @@
           <w:b w:val="0"/>
           <w:i w:val="0"/>
           <w:color w:val="2E3D50"/>
-          <w:sz w:val="18"/>
+          <w:sz w:val="20"/>
         </w:rPr>
         <w:t xml:space="preserve">, and </w:t>
       </w:r>
@@ -585,8 +585,8 @@
           <w:rPr>
             <w:color w:val="2B7FFF"/>
             <w:u w:val="single"/>
-            <w:sz w:val="18"/>
-            <w:szCs w:val="18"/>
+            <w:sz w:val="20"/>
+            <w:szCs w:val="20"/>
             <w:rFonts w:ascii="Times New Roman" w:hAnsi="Times New Roman"/>
           </w:rPr>
           <w:t xml:space="preserve">CyberScale</w:t>
@@ -598,7 +598,7 @@
           <w:b w:val="0"/>
           <w:i w:val="0"/>
           <w:color w:val="2E3D50"/>
-          <w:sz w:val="18"/>
+          <w:sz w:val="20"/>
         </w:rPr>
         <w:t xml:space="preserve">, Desservant en moyenne </w:t>
       </w:r>
@@ -608,7 +608,7 @@
           <w:b/>
           <w:i w:val="0"/>
           <w:color w:val="2E3D50"/>
-          <w:sz w:val="18"/>
+          <w:sz w:val="20"/>
         </w:rPr>
         <w:t>+3 000</w:t>
       </w:r>
@@ -618,7 +618,7 @@
           <w:b w:val="0"/>
           <w:i w:val="0"/>
           <w:color w:val="2E3D50"/>
-          <w:sz w:val="18"/>
+          <w:sz w:val="20"/>
         </w:rPr>
         <w:t xml:space="preserve"> utilisateurs actifs par jour, ce qui témoigne d'une grande fiabilité.</w:t>
       </w:r>
@@ -634,7 +634,7 @@
           <w:b w:val="0"/>
           <w:i w:val="0"/>
           <w:color w:val="2E3D50"/>
-          <w:sz w:val="18"/>
+          <w:sz w:val="20"/>
         </w:rPr>
         <w:t xml:space="preserve">A orchestré la collaboration entre les équipes front-end, back-end et QA pour améliorer les performances des applications de </w:t>
       </w:r>
@@ -644,7 +644,7 @@
           <w:b/>
           <w:i w:val="0"/>
           <w:color w:val="2E3D50"/>
-          <w:sz w:val="18"/>
+          <w:sz w:val="20"/>
         </w:rPr>
         <w:t>25%</w:t>
       </w:r>
@@ -654,7 +654,7 @@
           <w:b w:val="0"/>
           <w:i w:val="0"/>
           <w:color w:val="2E3D50"/>
-          <w:sz w:val="18"/>
+          <w:sz w:val="20"/>
         </w:rPr>
         <w:t xml:space="preserve"> grâce à l'optimisation du code et à la rationalisation des processus de déploiement, tout en assurant l'évolutivité et les meilleures pratiques de codage.</w:t>
       </w:r>
@@ -670,7 +670,7 @@
           <w:b/>
           <w:i w:val="0"/>
           <w:color w:val="2E3D50"/>
-          <w:sz w:val="18"/>
+          <w:sz w:val="20"/>
         </w:rPr>
         <w:t>Tech:</w:t>
       </w:r>
@@ -680,14 +680,14 @@
           <w:b w:val="0"/>
           <w:i w:val="0"/>
           <w:color w:val="2E3D50"/>
-          <w:sz w:val="18"/>
+          <w:sz w:val="20"/>
         </w:rPr>
         <w:t xml:space="preserve"> Nextjs, React, Typescript, MaterialUI, Laravel, Nodejs, Expressjs, MySQL.</w:t>
       </w:r>
     </w:p>
     <w:p>
       <w:pPr>
-        <w:spacing w:before="200" w:after="0" w:line="252" w:lineRule="auto"/>
+        <w:spacing w:before="280" w:after="0" w:line="252" w:lineRule="auto"/>
       </w:pPr>
       <w:r>
         <w:rPr>
@@ -713,7 +713,7 @@
           <w:b w:val="0"/>
           <w:i/>
           <w:color w:val="2E3D50"/>
-          <w:sz w:val="18"/>
+          <w:sz w:val="20"/>
         </w:rPr>
         <w:t>CBI</w:t>
       </w:r>
@@ -723,7 +723,7 @@
           <w:b w:val="0"/>
           <w:i/>
           <w:color w:val="2E3D50"/>
-          <w:sz w:val="18"/>
+          <w:sz w:val="20"/>
         </w:rPr>
         <w:tab/>
         <w:t>Septembre 2023 - Janvier 2024, Casablanca, Morocco</w:t>
@@ -740,7 +740,7 @@
           <w:b w:val="0"/>
           <w:i w:val="0"/>
           <w:color w:val="2E3D50"/>
-          <w:sz w:val="18"/>
+          <w:sz w:val="20"/>
         </w:rPr>
         <w:t xml:space="preserve">A assisté aux activités de pré-vente et a fourni un support dans la création d'offres Microsoft pour </w:t>
       </w:r>
@@ -750,7 +750,7 @@
           <w:b/>
           <w:i w:val="0"/>
           <w:color w:val="2E3D50"/>
-          <w:sz w:val="18"/>
+          <w:sz w:val="20"/>
         </w:rPr>
         <w:t>+100</w:t>
       </w:r>
@@ -760,7 +760,7 @@
           <w:b w:val="0"/>
           <w:i w:val="0"/>
           <w:color w:val="2E3D50"/>
-          <w:sz w:val="18"/>
+          <w:sz w:val="20"/>
         </w:rPr>
         <w:t xml:space="preserve"> clients.</w:t>
       </w:r>
@@ -776,7 +776,7 @@
           <w:b w:val="0"/>
           <w:i w:val="0"/>
           <w:color w:val="2E3D50"/>
-          <w:sz w:val="18"/>
+          <w:sz w:val="20"/>
         </w:rPr>
         <w:t>A géré les abonnements Microsoft via MWP (Microsoft Subscription Management - CSP), aidant les clients à optimiser leurs solutions cloud.</w:t>
       </w:r>
@@ -792,14 +792,14 @@
           <w:b w:val="0"/>
           <w:i w:val="0"/>
           <w:color w:val="2E3D50"/>
-          <w:sz w:val="18"/>
+          <w:sz w:val="20"/>
         </w:rPr>
         <w:t>A collaboré avec les clients pour comprendre les besoins et a fourni des solutions cloud Microsoft et améliorer leurs opérations commerciales.</w:t>
       </w:r>
     </w:p>
     <w:p>
       <w:pPr>
-        <w:spacing w:before="200" w:after="0" w:line="252" w:lineRule="auto"/>
+        <w:spacing w:before="280" w:after="0" w:line="252" w:lineRule="auto"/>
       </w:pPr>
       <w:r>
         <w:rPr>
@@ -825,7 +825,7 @@
           <w:b w:val="0"/>
           <w:i/>
           <w:color w:val="2E3D50"/>
-          <w:sz w:val="18"/>
+          <w:sz w:val="20"/>
         </w:rPr>
         <w:t>IS-TECH</w:t>
       </w:r>
@@ -835,7 +835,7 @@
           <w:b w:val="0"/>
           <w:i/>
           <w:color w:val="2E3D50"/>
-          <w:sz w:val="18"/>
+          <w:sz w:val="20"/>
         </w:rPr>
         <w:tab/>
         <w:t>Juillet 2023 - Novembre 2023, Casablanca, Morocco</w:t>
@@ -852,7 +852,7 @@
           <w:b w:val="0"/>
           <w:i w:val="0"/>
           <w:color w:val="2E3D50"/>
-          <w:sz w:val="18"/>
+          <w:sz w:val="20"/>
         </w:rPr>
         <w:t>A conçu et développé des applications web interactives.</w:t>
       </w:r>
@@ -868,7 +868,7 @@
           <w:b w:val="0"/>
           <w:i w:val="0"/>
           <w:color w:val="2E3D50"/>
-          <w:sz w:val="18"/>
+          <w:sz w:val="20"/>
         </w:rPr>
         <w:t>A intégré des API RESTful pour étendre les fonctionnalités de l'application principale, améliorant l'expérience utilisateur et rationalisant le flux de données à travers plusieurs modules.</w:t>
       </w:r>
@@ -884,7 +884,7 @@
           <w:b/>
           <w:i w:val="0"/>
           <w:color w:val="2E3D50"/>
-          <w:sz w:val="18"/>
+          <w:sz w:val="20"/>
         </w:rPr>
         <w:t>Tech:</w:t>
       </w:r>
@@ -894,14 +894,14 @@
           <w:b w:val="0"/>
           <w:i w:val="0"/>
           <w:color w:val="2E3D50"/>
-          <w:sz w:val="18"/>
+          <w:sz w:val="20"/>
         </w:rPr>
         <w:t xml:space="preserve"> React, Javascript, MaterialUI, Redux, Laravel, MySQL.</w:t>
       </w:r>
     </w:p>
     <w:p>
       <w:pPr>
-        <w:spacing w:before="200" w:after="0" w:line="252" w:lineRule="auto"/>
+        <w:spacing w:before="280" w:after="0" w:line="252" w:lineRule="auto"/>
       </w:pPr>
       <w:r>
         <w:rPr>
@@ -927,7 +927,7 @@
           <w:b w:val="0"/>
           <w:i/>
           <w:color w:val="2E3D50"/>
-          <w:sz w:val="18"/>
+          <w:sz w:val="20"/>
         </w:rPr>
         <w:t>Palmeraie Country Club</w:t>
       </w:r>
@@ -937,7 +937,7 @@
           <w:b w:val="0"/>
           <w:i/>
           <w:color w:val="2E3D50"/>
-          <w:sz w:val="18"/>
+          <w:sz w:val="20"/>
         </w:rPr>
         <w:tab/>
         <w:t>Juillet 2022 - Septembre 2022, Casablanca, Morocco</w:t>
@@ -954,7 +954,7 @@
           <w:b w:val="0"/>
           <w:i w:val="0"/>
           <w:color w:val="2E3D50"/>
-          <w:sz w:val="18"/>
+          <w:sz w:val="20"/>
         </w:rPr>
         <w:t>A conçu et développé une application web pour la gestion des adhésions et des abonnements utilisant HTML, CSS, JavaScript, PHP et MySQL.</w:t>
       </w:r>
@@ -979,7 +979,7 @@
     </w:p>
     <w:p>
       <w:pPr>
-        <w:spacing w:before="60" w:after="60" w:line="269" w:lineRule="auto"/>
+        <w:spacing w:before="100" w:after="100" w:line="288" w:lineRule="auto"/>
       </w:pPr>
       <w:r>
         <w:rPr>
@@ -987,7 +987,7 @@
           <w:b/>
           <w:i w:val="0"/>
           <w:color w:val="2E3D50"/>
-          <w:sz w:val="18"/>
+          <w:sz w:val="20"/>
         </w:rPr>
         <w:t xml:space="preserve">Langages de programmation: </w:t>
       </w:r>
@@ -997,14 +997,14 @@
           <w:b w:val="0"/>
           <w:i w:val="0"/>
           <w:color w:val="2E3D50"/>
-          <w:sz w:val="18"/>
+          <w:sz w:val="20"/>
         </w:rPr>
         <w:t>JavaScript, TypeScript, PHP, Python, Java, C/C++</w:t>
       </w:r>
     </w:p>
     <w:p>
       <w:pPr>
-        <w:spacing w:before="60" w:after="60" w:line="269" w:lineRule="auto"/>
+        <w:spacing w:before="100" w:after="100" w:line="288" w:lineRule="auto"/>
       </w:pPr>
       <w:r>
         <w:rPr>
@@ -1012,7 +1012,7 @@
           <w:b/>
           <w:i w:val="0"/>
           <w:color w:val="2E3D50"/>
-          <w:sz w:val="18"/>
+          <w:sz w:val="20"/>
         </w:rPr>
         <w:t xml:space="preserve">Frontend/ Backend: </w:t>
       </w:r>
@@ -1022,14 +1022,14 @@
           <w:b w:val="0"/>
           <w:i w:val="0"/>
           <w:color w:val="2E3D50"/>
-          <w:sz w:val="18"/>
+          <w:sz w:val="20"/>
         </w:rPr>
         <w:t>React.js, Next.js, Express, Node.js, Laravel</w:t>
       </w:r>
     </w:p>
     <w:p>
       <w:pPr>
-        <w:spacing w:before="60" w:after="60" w:line="269" w:lineRule="auto"/>
+        <w:spacing w:before="100" w:after="100" w:line="288" w:lineRule="auto"/>
       </w:pPr>
       <w:r>
         <w:rPr>
@@ -1037,7 +1037,7 @@
           <w:b/>
           <w:i w:val="0"/>
           <w:color w:val="2E3D50"/>
-          <w:sz w:val="18"/>
+          <w:sz w:val="20"/>
         </w:rPr>
         <w:t xml:space="preserve">Services Cloud: </w:t>
       </w:r>
@@ -1047,14 +1047,14 @@
           <w:b w:val="0"/>
           <w:i w:val="0"/>
           <w:color w:val="2E3D50"/>
-          <w:sz w:val="18"/>
+          <w:sz w:val="20"/>
         </w:rPr>
         <w:t>Google Cloud, Vercel, Cloudflare</w:t>
       </w:r>
     </w:p>
     <w:p>
       <w:pPr>
-        <w:spacing w:before="60" w:after="60" w:line="269" w:lineRule="auto"/>
+        <w:spacing w:before="100" w:after="100" w:line="288" w:lineRule="auto"/>
       </w:pPr>
       <w:r>
         <w:rPr>
@@ -1062,7 +1062,7 @@
           <w:b/>
           <w:i w:val="0"/>
           <w:color w:val="2E3D50"/>
-          <w:sz w:val="18"/>
+          <w:sz w:val="20"/>
         </w:rPr>
         <w:t xml:space="preserve">Database: </w:t>
       </w:r>
@@ -1072,14 +1072,14 @@
           <w:b w:val="0"/>
           <w:i w:val="0"/>
           <w:color w:val="2E3D50"/>
-          <w:sz w:val="18"/>
+          <w:sz w:val="20"/>
         </w:rPr>
         <w:t>MySQL, PostgreSQL, Supabase, MongoDB</w:t>
       </w:r>
     </w:p>
     <w:p>
       <w:pPr>
-        <w:spacing w:before="60" w:after="60" w:line="269" w:lineRule="auto"/>
+        <w:spacing w:before="100" w:after="100" w:line="288" w:lineRule="auto"/>
       </w:pPr>
       <w:r>
         <w:rPr>
@@ -1087,7 +1087,7 @@
           <w:b/>
           <w:i w:val="0"/>
           <w:color w:val="2E3D50"/>
-          <w:sz w:val="18"/>
+          <w:sz w:val="20"/>
         </w:rPr>
         <w:t xml:space="preserve">Intelligence Artificiel/ AI: </w:t>
       </w:r>
@@ -1097,14 +1097,14 @@
           <w:b w:val="0"/>
           <w:i w:val="0"/>
           <w:color w:val="2E3D50"/>
-          <w:sz w:val="18"/>
+          <w:sz w:val="20"/>
         </w:rPr>
         <w:t>OpenAI API, Claude, Cursor, Copilot, DeepSeek, Ollama, n8n</w:t>
       </w:r>
     </w:p>
     <w:p>
       <w:pPr>
-        <w:spacing w:before="60" w:after="60" w:line="269" w:lineRule="auto"/>
+        <w:spacing w:before="100" w:after="100" w:line="288" w:lineRule="auto"/>
       </w:pPr>
       <w:r>
         <w:rPr>
@@ -1112,7 +1112,7 @@
           <w:b/>
           <w:i w:val="0"/>
           <w:color w:val="2E3D50"/>
-          <w:sz w:val="18"/>
+          <w:sz w:val="20"/>
         </w:rPr>
         <w:t xml:space="preserve">Méthodologies: </w:t>
       </w:r>
@@ -1122,14 +1122,14 @@
           <w:b w:val="0"/>
           <w:i w:val="0"/>
           <w:color w:val="2E3D50"/>
-          <w:sz w:val="18"/>
+          <w:sz w:val="20"/>
         </w:rPr>
         <w:t>Agile, Scrum, Kanban, Design Pattern, Web Architecture</w:t>
       </w:r>
     </w:p>
     <w:p>
       <w:pPr>
-        <w:spacing w:before="60" w:after="60" w:line="269" w:lineRule="auto"/>
+        <w:spacing w:before="100" w:after="100" w:line="288" w:lineRule="auto"/>
       </w:pPr>
       <w:r>
         <w:rPr>
@@ -1137,7 +1137,7 @@
           <w:b/>
           <w:i w:val="0"/>
           <w:color w:val="2E3D50"/>
-          <w:sz w:val="18"/>
+          <w:sz w:val="20"/>
         </w:rPr>
         <w:t xml:space="preserve">Soft Skills: </w:t>
       </w:r>
@@ -1147,7 +1147,7 @@
           <w:b w:val="0"/>
           <w:i w:val="0"/>
           <w:color w:val="2E3D50"/>
-          <w:sz w:val="18"/>
+          <w:sz w:val="20"/>
         </w:rPr>
         <w:t>Communication, collaboration en équipe, résolution de problèmes, gestion du temps, adaptabilité</w:t>
       </w:r>
@@ -1180,7 +1180,7 @@
           <w:b/>
           <w:i w:val="0"/>
           <w:color w:val="2E3D50"/>
-          <w:sz w:val="18"/>
+          <w:sz w:val="20"/>
         </w:rPr>
         <w:t>Master: Ingénierie des systèmes intelligents</w:t>
       </w:r>
@@ -1195,7 +1195,7 @@
           <w:b w:val="0"/>
           <w:i w:val="0"/>
           <w:color w:val="2E3D50"/>
-          <w:sz w:val="18"/>
+          <w:sz w:val="20"/>
         </w:rPr>
         <w:t>Université Hassan 2 · Casablanca · 2026</w:t>
       </w:r>
@@ -1210,7 +1210,7 @@
           <w:b/>
           <w:i w:val="0"/>
           <w:color w:val="2E3D50"/>
-          <w:sz w:val="18"/>
+          <w:sz w:val="20"/>
         </w:rPr>
         <w:t>Licence Fondamentale SMI</w:t>
       </w:r>
@@ -1225,7 +1225,7 @@
           <w:b w:val="0"/>
           <w:i w:val="0"/>
           <w:color w:val="2E3D50"/>
-          <w:sz w:val="18"/>
+          <w:sz w:val="20"/>
         </w:rPr>
         <w:t>Université Hassan 2 · Casablanca · 2024</w:t>
       </w:r>
@@ -1240,7 +1240,7 @@
           <w:b/>
           <w:i w:val="0"/>
           <w:color w:val="2E3D50"/>
-          <w:sz w:val="18"/>
+          <w:sz w:val="20"/>
         </w:rPr>
         <w:t>DUT en Génie informatique</w:t>
       </w:r>
@@ -1255,7 +1255,7 @@
           <w:b w:val="0"/>
           <w:i w:val="0"/>
           <w:color w:val="2E3D50"/>
-          <w:sz w:val="18"/>
+          <w:sz w:val="20"/>
         </w:rPr>
         <w:t>Université Cadi Ayyad · Safi · 2021 - 2023</w:t>
       </w:r>
@@ -1636,7 +1636,7 @@
     <w:rPr>
       <w:rFonts w:ascii="Times New Roman" w:hAnsi="Times New Roman" w:eastAsia="Times New Roman"/>
       <w:color w:val="2E3D50"/>
-      <w:sz w:val="18"/>
+      <w:sz w:val="20"/>
     </w:rPr>
   </w:style>
   <w:style w:type="paragraph" w:styleId="Header">

</xml_diff>

<commit_message>
Center resume bullets and bold company/date lines
Align bullet dots to the vertical center of the first text line, and set company names and period/place to bold italic.

Co-authored-by: JellYouness <JellYouness@users.noreply.github.com>
</commit_message>
<xml_diff>
--- a/resume/output/Youness-Jellouli.docx
+++ b/resume/output/Youness-Jellouli.docx
@@ -382,7 +382,7 @@
       <w:r>
         <w:rPr>
           <w:rFonts w:ascii="Times New Roman" w:hAnsi="Times New Roman" w:eastAsia="Times New Roman"/>
-          <w:b w:val="0"/>
+          <w:b/>
           <w:i/>
           <w:color w:val="2E3D50"/>
           <w:sz w:val="20"/>
@@ -392,7 +392,7 @@
       <w:r>
         <w:rPr>
           <w:rFonts w:ascii="Times New Roman" w:hAnsi="Times New Roman" w:eastAsia="Times New Roman"/>
-          <w:b w:val="0"/>
+          <w:b/>
           <w:i/>
           <w:color w:val="2E3D50"/>
           <w:sz w:val="20"/>
@@ -480,7 +480,7 @@
       <w:r>
         <w:rPr>
           <w:rFonts w:ascii="Times New Roman" w:hAnsi="Times New Roman" w:eastAsia="Times New Roman"/>
-          <w:b w:val="0"/>
+          <w:b/>
           <w:i/>
           <w:color w:val="2E3D50"/>
           <w:sz w:val="20"/>
@@ -490,7 +490,7 @@
       <w:r>
         <w:rPr>
           <w:rFonts w:ascii="Times New Roman" w:hAnsi="Times New Roman" w:eastAsia="Times New Roman"/>
-          <w:b w:val="0"/>
+          <w:b/>
           <w:i/>
           <w:color w:val="2E3D50"/>
           <w:sz w:val="20"/>
@@ -710,7 +710,7 @@
       <w:r>
         <w:rPr>
           <w:rFonts w:ascii="Times New Roman" w:hAnsi="Times New Roman" w:eastAsia="Times New Roman"/>
-          <w:b w:val="0"/>
+          <w:b/>
           <w:i/>
           <w:color w:val="2E3D50"/>
           <w:sz w:val="20"/>
@@ -720,7 +720,7 @@
       <w:r>
         <w:rPr>
           <w:rFonts w:ascii="Times New Roman" w:hAnsi="Times New Roman" w:eastAsia="Times New Roman"/>
-          <w:b w:val="0"/>
+          <w:b/>
           <w:i/>
           <w:color w:val="2E3D50"/>
           <w:sz w:val="20"/>
@@ -822,7 +822,7 @@
       <w:r>
         <w:rPr>
           <w:rFonts w:ascii="Times New Roman" w:hAnsi="Times New Roman" w:eastAsia="Times New Roman"/>
-          <w:b w:val="0"/>
+          <w:b/>
           <w:i/>
           <w:color w:val="2E3D50"/>
           <w:sz w:val="20"/>
@@ -832,7 +832,7 @@
       <w:r>
         <w:rPr>
           <w:rFonts w:ascii="Times New Roman" w:hAnsi="Times New Roman" w:eastAsia="Times New Roman"/>
-          <w:b w:val="0"/>
+          <w:b/>
           <w:i/>
           <w:color w:val="2E3D50"/>
           <w:sz w:val="20"/>
@@ -924,7 +924,7 @@
       <w:r>
         <w:rPr>
           <w:rFonts w:ascii="Times New Roman" w:hAnsi="Times New Roman" w:eastAsia="Times New Roman"/>
-          <w:b w:val="0"/>
+          <w:b/>
           <w:i/>
           <w:color w:val="2E3D50"/>
           <w:sz w:val="20"/>
@@ -934,7 +934,7 @@
       <w:r>
         <w:rPr>
           <w:rFonts w:ascii="Times New Roman" w:hAnsi="Times New Roman" w:eastAsia="Times New Roman"/>
-          <w:b w:val="0"/>
+          <w:b/>
           <w:i/>
           <w:color w:val="2E3D50"/>
           <w:sz w:val="20"/>

</xml_diff>

<commit_message>
Tighten resume bullets: smaller dots and closer lines
Shrink bullet size while keeping them centered on the first line, and reduce line-height between bullet lines.

Co-authored-by: JellYouness <JellYouness@users.noreply.github.com>
</commit_message>
<xml_diff>
--- a/resume/output/Youness-Jellouli.docx
+++ b/resume/output/Youness-Jellouli.docx
@@ -404,7 +404,7 @@
     <w:p>
       <w:pPr>
         <w:pStyle w:val="ListBullet"/>
-        <w:spacing w:before="0" w:after="20" w:line="269" w:lineRule="auto"/>
+        <w:spacing w:before="0" w:after="0" w:line="259" w:lineRule="auto"/>
       </w:pPr>
       <w:hyperlink r:id="rId15">
         <w:r>
@@ -432,7 +432,7 @@
     <w:p>
       <w:pPr>
         <w:pStyle w:val="ListBullet"/>
-        <w:spacing w:before="0" w:after="20" w:line="269" w:lineRule="auto"/>
+        <w:spacing w:before="0" w:after="0" w:line="259" w:lineRule="auto"/>
       </w:pPr>
       <w:r>
         <w:rPr>
@@ -502,7 +502,7 @@
     <w:p>
       <w:pPr>
         <w:pStyle w:val="ListBullet"/>
-        <w:spacing w:before="0" w:after="20" w:line="269" w:lineRule="auto"/>
+        <w:spacing w:before="0" w:after="0" w:line="259" w:lineRule="auto"/>
       </w:pPr>
       <w:r>
         <w:rPr>
@@ -626,7 +626,7 @@
     <w:p>
       <w:pPr>
         <w:pStyle w:val="ListBullet"/>
-        <w:spacing w:before="0" w:after="20" w:line="269" w:lineRule="auto"/>
+        <w:spacing w:before="0" w:after="0" w:line="259" w:lineRule="auto"/>
       </w:pPr>
       <w:r>
         <w:rPr>
@@ -662,7 +662,7 @@
     <w:p>
       <w:pPr>
         <w:pStyle w:val="ListBullet"/>
-        <w:spacing w:before="0" w:after="20" w:line="269" w:lineRule="auto"/>
+        <w:spacing w:before="0" w:after="0" w:line="259" w:lineRule="auto"/>
       </w:pPr>
       <w:r>
         <w:rPr>
@@ -732,7 +732,7 @@
     <w:p>
       <w:pPr>
         <w:pStyle w:val="ListBullet"/>
-        <w:spacing w:before="0" w:after="20" w:line="269" w:lineRule="auto"/>
+        <w:spacing w:before="0" w:after="0" w:line="259" w:lineRule="auto"/>
       </w:pPr>
       <w:r>
         <w:rPr>
@@ -768,7 +768,7 @@
     <w:p>
       <w:pPr>
         <w:pStyle w:val="ListBullet"/>
-        <w:spacing w:before="0" w:after="20" w:line="269" w:lineRule="auto"/>
+        <w:spacing w:before="0" w:after="0" w:line="259" w:lineRule="auto"/>
       </w:pPr>
       <w:r>
         <w:rPr>
@@ -784,7 +784,7 @@
     <w:p>
       <w:pPr>
         <w:pStyle w:val="ListBullet"/>
-        <w:spacing w:before="0" w:after="20" w:line="269" w:lineRule="auto"/>
+        <w:spacing w:before="0" w:after="0" w:line="259" w:lineRule="auto"/>
       </w:pPr>
       <w:r>
         <w:rPr>
@@ -844,7 +844,7 @@
     <w:p>
       <w:pPr>
         <w:pStyle w:val="ListBullet"/>
-        <w:spacing w:before="0" w:after="20" w:line="269" w:lineRule="auto"/>
+        <w:spacing w:before="0" w:after="0" w:line="259" w:lineRule="auto"/>
       </w:pPr>
       <w:r>
         <w:rPr>
@@ -860,7 +860,7 @@
     <w:p>
       <w:pPr>
         <w:pStyle w:val="ListBullet"/>
-        <w:spacing w:before="0" w:after="20" w:line="269" w:lineRule="auto"/>
+        <w:spacing w:before="0" w:after="0" w:line="259" w:lineRule="auto"/>
       </w:pPr>
       <w:r>
         <w:rPr>
@@ -876,7 +876,7 @@
     <w:p>
       <w:pPr>
         <w:pStyle w:val="ListBullet"/>
-        <w:spacing w:before="0" w:after="20" w:line="269" w:lineRule="auto"/>
+        <w:spacing w:before="0" w:after="0" w:line="259" w:lineRule="auto"/>
       </w:pPr>
       <w:r>
         <w:rPr>
@@ -946,7 +946,7 @@
     <w:p>
       <w:pPr>
         <w:pStyle w:val="ListBullet"/>
-        <w:spacing w:before="0" w:after="20" w:line="269" w:lineRule="auto"/>
+        <w:spacing w:before="0" w:after="0" w:line="259" w:lineRule="auto"/>
       </w:pPr>
       <w:r>
         <w:rPr>

</xml_diff>

<commit_message>
Shrink resume bullets further and tighten line-height
Use 1.6px centered dots and 1.05 line-height so wrapped bullet
lines sit closer together without shifting alignment.

Co-authored-by: JellYouness <JellYouness@users.noreply.github.com>
</commit_message>
<xml_diff>
--- a/resume/output/Youness-Jellouli.docx
+++ b/resume/output/Youness-Jellouli.docx
@@ -404,7 +404,7 @@
     <w:p>
       <w:pPr>
         <w:pStyle w:val="ListBullet"/>
-        <w:spacing w:before="0" w:after="0" w:line="259" w:lineRule="auto"/>
+        <w:spacing w:before="0" w:after="0" w:line="245" w:lineRule="auto"/>
       </w:pPr>
       <w:hyperlink r:id="rId15">
         <w:r>
@@ -432,7 +432,7 @@
     <w:p>
       <w:pPr>
         <w:pStyle w:val="ListBullet"/>
-        <w:spacing w:before="0" w:after="0" w:line="259" w:lineRule="auto"/>
+        <w:spacing w:before="0" w:after="0" w:line="245" w:lineRule="auto"/>
       </w:pPr>
       <w:r>
         <w:rPr>
@@ -502,7 +502,7 @@
     <w:p>
       <w:pPr>
         <w:pStyle w:val="ListBullet"/>
-        <w:spacing w:before="0" w:after="0" w:line="259" w:lineRule="auto"/>
+        <w:spacing w:before="0" w:after="0" w:line="245" w:lineRule="auto"/>
       </w:pPr>
       <w:r>
         <w:rPr>
@@ -626,7 +626,7 @@
     <w:p>
       <w:pPr>
         <w:pStyle w:val="ListBullet"/>
-        <w:spacing w:before="0" w:after="0" w:line="259" w:lineRule="auto"/>
+        <w:spacing w:before="0" w:after="0" w:line="245" w:lineRule="auto"/>
       </w:pPr>
       <w:r>
         <w:rPr>
@@ -662,7 +662,7 @@
     <w:p>
       <w:pPr>
         <w:pStyle w:val="ListBullet"/>
-        <w:spacing w:before="0" w:after="0" w:line="259" w:lineRule="auto"/>
+        <w:spacing w:before="0" w:after="0" w:line="245" w:lineRule="auto"/>
       </w:pPr>
       <w:r>
         <w:rPr>
@@ -732,7 +732,7 @@
     <w:p>
       <w:pPr>
         <w:pStyle w:val="ListBullet"/>
-        <w:spacing w:before="0" w:after="0" w:line="259" w:lineRule="auto"/>
+        <w:spacing w:before="0" w:after="0" w:line="245" w:lineRule="auto"/>
       </w:pPr>
       <w:r>
         <w:rPr>
@@ -768,7 +768,7 @@
     <w:p>
       <w:pPr>
         <w:pStyle w:val="ListBullet"/>
-        <w:spacing w:before="0" w:after="0" w:line="259" w:lineRule="auto"/>
+        <w:spacing w:before="0" w:after="0" w:line="245" w:lineRule="auto"/>
       </w:pPr>
       <w:r>
         <w:rPr>
@@ -784,7 +784,7 @@
     <w:p>
       <w:pPr>
         <w:pStyle w:val="ListBullet"/>
-        <w:spacing w:before="0" w:after="0" w:line="259" w:lineRule="auto"/>
+        <w:spacing w:before="0" w:after="0" w:line="245" w:lineRule="auto"/>
       </w:pPr>
       <w:r>
         <w:rPr>
@@ -844,7 +844,7 @@
     <w:p>
       <w:pPr>
         <w:pStyle w:val="ListBullet"/>
-        <w:spacing w:before="0" w:after="0" w:line="259" w:lineRule="auto"/>
+        <w:spacing w:before="0" w:after="0" w:line="245" w:lineRule="auto"/>
       </w:pPr>
       <w:r>
         <w:rPr>
@@ -860,7 +860,7 @@
     <w:p>
       <w:pPr>
         <w:pStyle w:val="ListBullet"/>
-        <w:spacing w:before="0" w:after="0" w:line="259" w:lineRule="auto"/>
+        <w:spacing w:before="0" w:after="0" w:line="245" w:lineRule="auto"/>
       </w:pPr>
       <w:r>
         <w:rPr>
@@ -876,7 +876,7 @@
     <w:p>
       <w:pPr>
         <w:pStyle w:val="ListBullet"/>
-        <w:spacing w:before="0" w:after="0" w:line="259" w:lineRule="auto"/>
+        <w:spacing w:before="0" w:after="0" w:line="245" w:lineRule="auto"/>
       </w:pPr>
       <w:r>
         <w:rPr>
@@ -946,7 +946,7 @@
     <w:p>
       <w:pPr>
         <w:pStyle w:val="ListBullet"/>
-        <w:spacing w:before="0" w:after="0" w:line="259" w:lineRule="auto"/>
+        <w:spacing w:before="0" w:after="0" w:line="245" w:lineRule="auto"/>
       </w:pPr>
       <w:r>
         <w:rPr>

</xml_diff>

<commit_message>
Ease resume bullet line-height slightly
Raise wrapped bullet leading from 1.05 to 1.14 so lines are
less cramped, while keeping the smaller centered dots.

Co-authored-by: JellYouness <JellYouness@users.noreply.github.com>
</commit_message>
<xml_diff>
--- a/resume/output/Youness-Jellouli.docx
+++ b/resume/output/Youness-Jellouli.docx
@@ -404,7 +404,7 @@
     <w:p>
       <w:pPr>
         <w:pStyle w:val="ListBullet"/>
-        <w:spacing w:before="0" w:after="0" w:line="245" w:lineRule="auto"/>
+        <w:spacing w:before="0" w:after="0" w:line="269" w:lineRule="auto"/>
       </w:pPr>
       <w:hyperlink r:id="rId15">
         <w:r>
@@ -432,7 +432,7 @@
     <w:p>
       <w:pPr>
         <w:pStyle w:val="ListBullet"/>
-        <w:spacing w:before="0" w:after="0" w:line="245" w:lineRule="auto"/>
+        <w:spacing w:before="0" w:after="0" w:line="269" w:lineRule="auto"/>
       </w:pPr>
       <w:r>
         <w:rPr>
@@ -502,7 +502,7 @@
     <w:p>
       <w:pPr>
         <w:pStyle w:val="ListBullet"/>
-        <w:spacing w:before="0" w:after="0" w:line="245" w:lineRule="auto"/>
+        <w:spacing w:before="0" w:after="0" w:line="269" w:lineRule="auto"/>
       </w:pPr>
       <w:r>
         <w:rPr>
@@ -626,7 +626,7 @@
     <w:p>
       <w:pPr>
         <w:pStyle w:val="ListBullet"/>
-        <w:spacing w:before="0" w:after="0" w:line="245" w:lineRule="auto"/>
+        <w:spacing w:before="0" w:after="0" w:line="269" w:lineRule="auto"/>
       </w:pPr>
       <w:r>
         <w:rPr>
@@ -662,7 +662,7 @@
     <w:p>
       <w:pPr>
         <w:pStyle w:val="ListBullet"/>
-        <w:spacing w:before="0" w:after="0" w:line="245" w:lineRule="auto"/>
+        <w:spacing w:before="0" w:after="0" w:line="269" w:lineRule="auto"/>
       </w:pPr>
       <w:r>
         <w:rPr>
@@ -732,7 +732,7 @@
     <w:p>
       <w:pPr>
         <w:pStyle w:val="ListBullet"/>
-        <w:spacing w:before="0" w:after="0" w:line="245" w:lineRule="auto"/>
+        <w:spacing w:before="0" w:after="0" w:line="269" w:lineRule="auto"/>
       </w:pPr>
       <w:r>
         <w:rPr>
@@ -768,7 +768,7 @@
     <w:p>
       <w:pPr>
         <w:pStyle w:val="ListBullet"/>
-        <w:spacing w:before="0" w:after="0" w:line="245" w:lineRule="auto"/>
+        <w:spacing w:before="0" w:after="0" w:line="269" w:lineRule="auto"/>
       </w:pPr>
       <w:r>
         <w:rPr>
@@ -784,7 +784,7 @@
     <w:p>
       <w:pPr>
         <w:pStyle w:val="ListBullet"/>
-        <w:spacing w:before="0" w:after="0" w:line="245" w:lineRule="auto"/>
+        <w:spacing w:before="0" w:after="0" w:line="269" w:lineRule="auto"/>
       </w:pPr>
       <w:r>
         <w:rPr>
@@ -844,7 +844,7 @@
     <w:p>
       <w:pPr>
         <w:pStyle w:val="ListBullet"/>
-        <w:spacing w:before="0" w:after="0" w:line="245" w:lineRule="auto"/>
+        <w:spacing w:before="0" w:after="0" w:line="269" w:lineRule="auto"/>
       </w:pPr>
       <w:r>
         <w:rPr>
@@ -860,7 +860,7 @@
     <w:p>
       <w:pPr>
         <w:pStyle w:val="ListBullet"/>
-        <w:spacing w:before="0" w:after="0" w:line="245" w:lineRule="auto"/>
+        <w:spacing w:before="0" w:after="0" w:line="269" w:lineRule="auto"/>
       </w:pPr>
       <w:r>
         <w:rPr>
@@ -876,7 +876,7 @@
     <w:p>
       <w:pPr>
         <w:pStyle w:val="ListBullet"/>
-        <w:spacing w:before="0" w:after="0" w:line="245" w:lineRule="auto"/>
+        <w:spacing w:before="0" w:after="0" w:line="269" w:lineRule="auto"/>
       </w:pPr>
       <w:r>
         <w:rPr>
@@ -946,7 +946,7 @@
     <w:p>
       <w:pPr>
         <w:pStyle w:val="ListBullet"/>
-        <w:spacing w:before="0" w:after="0" w:line="245" w:lineRule="auto"/>
+        <w:spacing w:before="0" w:after="0" w:line="269" w:lineRule="auto"/>
       </w:pPr>
       <w:r>
         <w:rPr>

</xml_diff>

<commit_message>
Add a compact Projets section to the baseline resume
Include AppartAli, AVSM Club, Invoicr, and Travel Flow with live
links, and keep the PDF on one page.

Co-authored-by: JellYouness <JellYouness@users.noreply.github.com>
</commit_message>
<xml_diff>
--- a/resume/output/Youness-Jellouli.docx
+++ b/resume/output/Youness-Jellouli.docx
@@ -974,6 +974,200 @@
           <w:color w:val="2E3D50"/>
           <w:sz w:val="24"/>
         </w:rPr>
+        <w:t>PROJETS</w:t>
+      </w:r>
+    </w:p>
+    <w:p>
+      <w:pPr>
+        <w:spacing w:before="60" w:after="0" w:line="252" w:lineRule="auto"/>
+      </w:pPr>
+      <w:hyperlink r:id="rId16">
+        <w:r>
+          <w:rPr>
+            <w:color w:val="2B7FFF"/>
+            <w:u w:val="single"/>
+            <w:sz w:val="22"/>
+            <w:szCs w:val="22"/>
+            <w:rFonts w:ascii="Times New Roman" w:hAnsi="Times New Roman"/>
+            <w:b/>
+          </w:rPr>
+          <w:t xml:space="preserve">AppartAli</w:t>
+        </w:r>
+      </w:hyperlink>
+      <w:r>
+        <w:rPr>
+          <w:rFonts w:ascii="Times New Roman" w:hAnsi="Times New Roman" w:eastAsia="Times New Roman"/>
+          <w:b w:val="0"/>
+          <w:i/>
+          <w:color w:val="2E3D50"/>
+          <w:sz w:val="18"/>
+        </w:rPr>
+        <w:t xml:space="preserve">  ·  Next.js, TypeScript, Tailwind CSS, Prisma</w:t>
+      </w:r>
+    </w:p>
+    <w:p>
+      <w:pPr>
+        <w:pStyle w:val="ListBullet"/>
+        <w:spacing w:before="0" w:after="0" w:line="269" w:lineRule="auto"/>
+      </w:pPr>
+      <w:r>
+        <w:rPr>
+          <w:rFonts w:ascii="Times New Roman" w:hAnsi="Times New Roman" w:eastAsia="Times New Roman"/>
+          <w:b w:val="0"/>
+          <w:i w:val="0"/>
+          <w:color w:val="2E3D50"/>
+          <w:sz w:val="20"/>
+        </w:rPr>
+        <w:t>Plateforme immobilière avec recherche, filtres (API Guesty) et assistant IA.</w:t>
+      </w:r>
+    </w:p>
+    <w:p>
+      <w:pPr>
+        <w:spacing w:before="60" w:after="0" w:line="252" w:lineRule="auto"/>
+      </w:pPr>
+      <w:hyperlink r:id="rId17">
+        <w:r>
+          <w:rPr>
+            <w:color w:val="2B7FFF"/>
+            <w:u w:val="single"/>
+            <w:sz w:val="22"/>
+            <w:szCs w:val="22"/>
+            <w:rFonts w:ascii="Times New Roman" w:hAnsi="Times New Roman"/>
+            <w:b/>
+          </w:rPr>
+          <w:t xml:space="preserve">AVSM Club</w:t>
+        </w:r>
+      </w:hyperlink>
+      <w:r>
+        <w:rPr>
+          <w:rFonts w:ascii="Times New Roman" w:hAnsi="Times New Roman" w:eastAsia="Times New Roman"/>
+          <w:b w:val="0"/>
+          <w:i/>
+          <w:color w:val="2E3D50"/>
+          <w:sz w:val="18"/>
+        </w:rPr>
+        <w:t xml:space="preserve">  ·  Next.js, TypeScript, Tailwind CSS</w:t>
+      </w:r>
+    </w:p>
+    <w:p>
+      <w:pPr>
+        <w:pStyle w:val="ListBullet"/>
+        <w:spacing w:before="0" w:after="0" w:line="269" w:lineRule="auto"/>
+      </w:pPr>
+      <w:r>
+        <w:rPr>
+          <w:rFonts w:ascii="Times New Roman" w:hAnsi="Times New Roman" w:eastAsia="Times New Roman"/>
+          <w:b w:val="0"/>
+          <w:i w:val="0"/>
+          <w:color w:val="2E3D50"/>
+          <w:sz w:val="20"/>
+        </w:rPr>
+        <w:t>Site du club avec CMS admin, matchs, actualités, effectifs et galeries.</w:t>
+      </w:r>
+    </w:p>
+    <w:p>
+      <w:pPr>
+        <w:spacing w:before="60" w:after="0" w:line="252" w:lineRule="auto"/>
+      </w:pPr>
+      <w:hyperlink r:id="rId18">
+        <w:r>
+          <w:rPr>
+            <w:color w:val="2B7FFF"/>
+            <w:u w:val="single"/>
+            <w:sz w:val="22"/>
+            <w:szCs w:val="22"/>
+            <w:rFonts w:ascii="Times New Roman" w:hAnsi="Times New Roman"/>
+            <w:b/>
+          </w:rPr>
+          <w:t xml:space="preserve">Invoicr SaaS</w:t>
+        </w:r>
+      </w:hyperlink>
+      <w:r>
+        <w:rPr>
+          <w:rFonts w:ascii="Times New Roman" w:hAnsi="Times New Roman" w:eastAsia="Times New Roman"/>
+          <w:b w:val="0"/>
+          <w:i/>
+          <w:color w:val="2E3D50"/>
+          <w:sz w:val="18"/>
+        </w:rPr>
+        <w:t xml:space="preserve">  ·  Next.js, TypeScript, Tailwind CSS, Supabase</w:t>
+      </w:r>
+    </w:p>
+    <w:p>
+      <w:pPr>
+        <w:pStyle w:val="ListBullet"/>
+        <w:spacing w:before="0" w:after="0" w:line="269" w:lineRule="auto"/>
+      </w:pPr>
+      <w:r>
+        <w:rPr>
+          <w:rFonts w:ascii="Times New Roman" w:hAnsi="Times New Roman" w:eastAsia="Times New Roman"/>
+          <w:b w:val="0"/>
+          <w:i w:val="0"/>
+          <w:color w:val="2E3D50"/>
+          <w:sz w:val="20"/>
+        </w:rPr>
+        <w:t>Génération et gestion de factures : recherche, filtres et suivi.</w:t>
+      </w:r>
+    </w:p>
+    <w:p>
+      <w:pPr>
+        <w:spacing w:before="60" w:after="0" w:line="252" w:lineRule="auto"/>
+      </w:pPr>
+      <w:hyperlink r:id="rId21">
+        <w:r>
+          <w:rPr>
+            <w:color w:val="2B7FFF"/>
+            <w:u w:val="single"/>
+            <w:sz w:val="22"/>
+            <w:szCs w:val="22"/>
+            <w:rFonts w:ascii="Times New Roman" w:hAnsi="Times New Roman"/>
+            <w:b/>
+          </w:rPr>
+          <w:t xml:space="preserve">Travel Flow</w:t>
+        </w:r>
+      </w:hyperlink>
+      <w:r>
+        <w:rPr>
+          <w:rFonts w:ascii="Times New Roman" w:hAnsi="Times New Roman" w:eastAsia="Times New Roman"/>
+          <w:b w:val="0"/>
+          <w:i/>
+          <w:color w:val="2E3D50"/>
+          <w:sz w:val="18"/>
+        </w:rPr>
+        <w:t xml:space="preserve">  ·  Next.js, TypeScript, Material UI, Python</w:t>
+      </w:r>
+    </w:p>
+    <w:p>
+      <w:pPr>
+        <w:pStyle w:val="ListBullet"/>
+        <w:spacing w:before="0" w:after="0" w:line="269" w:lineRule="auto"/>
+      </w:pPr>
+      <w:r>
+        <w:rPr>
+          <w:rFonts w:ascii="Times New Roman" w:hAnsi="Times New Roman" w:eastAsia="Times New Roman"/>
+          <w:b w:val="0"/>
+          <w:i w:val="0"/>
+          <w:color w:val="2E3D50"/>
+          <w:sz w:val="20"/>
+        </w:rPr>
+        <w:t>Optimisation d'itinéraires (problème du voyageur de commerce).</w:t>
+      </w:r>
+    </w:p>
+    <w:p>
+      <w:pPr>
+        <w:spacing w:before="200" w:after="80" w:line="240" w:lineRule="auto"/>
+        <w:pBdr>
+          <w:bottom w:val="single" w:sz="12" w:space="1" w:color="2E3D50"/>
+        </w:pBdr>
+      </w:pPr>
+      <w:r>
+        <w:rPr>
+          <w:rFonts w:ascii="Times New Roman" w:hAnsi="Times New Roman" w:eastAsia="Times New Roman"/>
+          <w:b/>
+          <w:i w:val="0"/>
+          <w:color w:val="2E3D50"/>
+          <w:sz w:val="24"/>
+        </w:rPr>
         <w:t>COMPÉTENCES</w:t>
       </w:r>
     </w:p>

</xml_diff>

<commit_message>
Raise resume bullet line-height slightly
Increase wrapped bullet leading from 1.14 to 1.22 while keeping
the smaller centered dots and a one-page PDF.

Co-authored-by: JellYouness <JellYouness@users.noreply.github.com>
</commit_message>
<xml_diff>
--- a/resume/output/Youness-Jellouli.docx
+++ b/resume/output/Youness-Jellouli.docx
@@ -404,7 +404,7 @@
     <w:p>
       <w:pPr>
         <w:pStyle w:val="ListBullet"/>
-        <w:spacing w:before="0" w:after="0" w:line="269" w:lineRule="auto"/>
+        <w:spacing w:before="0" w:after="0" w:line="283" w:lineRule="auto"/>
       </w:pPr>
       <w:hyperlink r:id="rId15">
         <w:r>
@@ -432,7 +432,7 @@
     <w:p>
       <w:pPr>
         <w:pStyle w:val="ListBullet"/>
-        <w:spacing w:before="0" w:after="0" w:line="269" w:lineRule="auto"/>
+        <w:spacing w:before="0" w:after="0" w:line="283" w:lineRule="auto"/>
       </w:pPr>
       <w:r>
         <w:rPr>
@@ -502,7 +502,7 @@
     <w:p>
       <w:pPr>
         <w:pStyle w:val="ListBullet"/>
-        <w:spacing w:before="0" w:after="0" w:line="269" w:lineRule="auto"/>
+        <w:spacing w:before="0" w:after="0" w:line="283" w:lineRule="auto"/>
       </w:pPr>
       <w:r>
         <w:rPr>
@@ -626,7 +626,7 @@
     <w:p>
       <w:pPr>
         <w:pStyle w:val="ListBullet"/>
-        <w:spacing w:before="0" w:after="0" w:line="269" w:lineRule="auto"/>
+        <w:spacing w:before="0" w:after="0" w:line="283" w:lineRule="auto"/>
       </w:pPr>
       <w:r>
         <w:rPr>
@@ -662,7 +662,7 @@
     <w:p>
       <w:pPr>
         <w:pStyle w:val="ListBullet"/>
-        <w:spacing w:before="0" w:after="0" w:line="269" w:lineRule="auto"/>
+        <w:spacing w:before="0" w:after="0" w:line="283" w:lineRule="auto"/>
       </w:pPr>
       <w:r>
         <w:rPr>
@@ -732,7 +732,7 @@
     <w:p>
       <w:pPr>
         <w:pStyle w:val="ListBullet"/>
-        <w:spacing w:before="0" w:after="0" w:line="269" w:lineRule="auto"/>
+        <w:spacing w:before="0" w:after="0" w:line="283" w:lineRule="auto"/>
       </w:pPr>
       <w:r>
         <w:rPr>
@@ -768,7 +768,7 @@
     <w:p>
       <w:pPr>
         <w:pStyle w:val="ListBullet"/>
-        <w:spacing w:before="0" w:after="0" w:line="269" w:lineRule="auto"/>
+        <w:spacing w:before="0" w:after="0" w:line="283" w:lineRule="auto"/>
       </w:pPr>
       <w:r>
         <w:rPr>
@@ -784,7 +784,7 @@
     <w:p>
       <w:pPr>
         <w:pStyle w:val="ListBullet"/>
-        <w:spacing w:before="0" w:after="0" w:line="269" w:lineRule="auto"/>
+        <w:spacing w:before="0" w:after="0" w:line="283" w:lineRule="auto"/>
       </w:pPr>
       <w:r>
         <w:rPr>
@@ -844,7 +844,7 @@
     <w:p>
       <w:pPr>
         <w:pStyle w:val="ListBullet"/>
-        <w:spacing w:before="0" w:after="0" w:line="269" w:lineRule="auto"/>
+        <w:spacing w:before="0" w:after="0" w:line="283" w:lineRule="auto"/>
       </w:pPr>
       <w:r>
         <w:rPr>
@@ -860,7 +860,7 @@
     <w:p>
       <w:pPr>
         <w:pStyle w:val="ListBullet"/>
-        <w:spacing w:before="0" w:after="0" w:line="269" w:lineRule="auto"/>
+        <w:spacing w:before="0" w:after="0" w:line="283" w:lineRule="auto"/>
       </w:pPr>
       <w:r>
         <w:rPr>
@@ -876,7 +876,7 @@
     <w:p>
       <w:pPr>
         <w:pStyle w:val="ListBullet"/>
-        <w:spacing w:before="0" w:after="0" w:line="269" w:lineRule="auto"/>
+        <w:spacing w:before="0" w:after="0" w:line="283" w:lineRule="auto"/>
       </w:pPr>
       <w:r>
         <w:rPr>
@@ -946,7 +946,7 @@
     <w:p>
       <w:pPr>
         <w:pStyle w:val="ListBullet"/>
-        <w:spacing w:before="0" w:after="0" w:line="269" w:lineRule="auto"/>
+        <w:spacing w:before="0" w:after="0" w:line="283" w:lineRule="auto"/>
       </w:pPr>
       <w:r>
         <w:rPr>
@@ -1008,7 +1008,7 @@
     <w:p>
       <w:pPr>
         <w:pStyle w:val="ListBullet"/>
-        <w:spacing w:before="0" w:after="0" w:line="269" w:lineRule="auto"/>
+        <w:spacing w:before="0" w:after="0" w:line="283" w:lineRule="auto"/>
       </w:pPr>
       <w:r>
         <w:rPr>
@@ -1052,7 +1052,7 @@
     <w:p>
       <w:pPr>
         <w:pStyle w:val="ListBullet"/>
-        <w:spacing w:before="0" w:after="0" w:line="269" w:lineRule="auto"/>
+        <w:spacing w:before="0" w:after="0" w:line="283" w:lineRule="auto"/>
       </w:pPr>
       <w:r>
         <w:rPr>
@@ -1096,7 +1096,7 @@
     <w:p>
       <w:pPr>
         <w:pStyle w:val="ListBullet"/>
-        <w:spacing w:before="0" w:after="0" w:line="269" w:lineRule="auto"/>
+        <w:spacing w:before="0" w:after="0" w:line="283" w:lineRule="auto"/>
       </w:pPr>
       <w:r>
         <w:rPr>
@@ -1140,7 +1140,7 @@
     <w:p>
       <w:pPr>
         <w:pStyle w:val="ListBullet"/>
-        <w:spacing w:before="0" w:after="0" w:line="269" w:lineRule="auto"/>
+        <w:spacing w:before="0" w:after="0" w:line="283" w:lineRule="auto"/>
       </w:pPr>
       <w:r>
         <w:rPr>

</xml_diff>

<commit_message>
Set resume projects to AppartAli, AVSM, Invoicr, IBC, Wifina
Replace Travel Flow with IBC and Wifina in the Projets section,
and keep the PDF on one page.

Co-authored-by: JellYouness <JellYouness@users.noreply.github.com>
</commit_message>
<xml_diff>
--- a/resume/output/Youness-Jellouli.docx
+++ b/resume/output/Youness-Jellouli.docx
@@ -1079,7 +1079,7 @@
             <w:rFonts w:ascii="Times New Roman" w:hAnsi="Times New Roman"/>
             <w:b/>
           </w:rPr>
-          <w:t xml:space="preserve">Invoicr SaaS</w:t>
+          <w:t xml:space="preserve">Invoicr</w:t>
         </w:r>
       </w:hyperlink>
       <w:r>
@@ -1113,7 +1113,7 @@
       <w:pPr>
         <w:spacing w:before="60" w:after="0" w:line="252" w:lineRule="auto"/>
       </w:pPr>
-      <w:hyperlink r:id="rId21">
+      <w:hyperlink r:id="rId14">
         <w:r>
           <w:rPr>
             <w:color w:val="2B7FFF"/>
@@ -1123,7 +1123,7 @@
             <w:rFonts w:ascii="Times New Roman" w:hAnsi="Times New Roman"/>
             <w:b/>
           </w:rPr>
-          <w:t xml:space="preserve">Travel Flow</w:t>
+          <w:t xml:space="preserve">IBC</w:t>
         </w:r>
       </w:hyperlink>
       <w:r>
@@ -1134,7 +1134,7 @@
           <w:color w:val="2E3D50"/>
           <w:sz w:val="18"/>
         </w:rPr>
-        <w:t xml:space="preserve">  ·  Next.js, TypeScript, Material UI, Python</w:t>
+        <w:t xml:space="preserve">  ·  Next.js, TypeScript, Material UI</w:t>
       </w:r>
     </w:p>
     <w:p>
@@ -1150,7 +1150,51 @@
           <w:color w:val="2E3D50"/>
           <w:sz w:val="20"/>
         </w:rPr>
-        <w:t>Optimisation d'itinéraires (problème du voyageur de commerce).</w:t>
+        <w:t>Anticipation des compétences pour l'emploi et la formation (Centre-Val de Loire).</w:t>
+      </w:r>
+    </w:p>
+    <w:p>
+      <w:pPr>
+        <w:spacing w:before="60" w:after="0" w:line="252" w:lineRule="auto"/>
+      </w:pPr>
+      <w:hyperlink r:id="rId13">
+        <w:r>
+          <w:rPr>
+            <w:color w:val="2B7FFF"/>
+            <w:u w:val="single"/>
+            <w:sz w:val="22"/>
+            <w:szCs w:val="22"/>
+            <w:rFonts w:ascii="Times New Roman" w:hAnsi="Times New Roman"/>
+            <w:b/>
+          </w:rPr>
+          <w:t xml:space="preserve">Wifina</w:t>
+        </w:r>
+      </w:hyperlink>
+      <w:r>
+        <w:rPr>
+          <w:rFonts w:ascii="Times New Roman" w:hAnsi="Times New Roman" w:eastAsia="Times New Roman"/>
+          <w:b w:val="0"/>
+          <w:i/>
+          <w:color w:val="2E3D50"/>
+          <w:sz w:val="18"/>
+        </w:rPr>
+        <w:t xml:space="preserve">  ·  Next.js, TypeScript, Material UI, Laravel</w:t>
+      </w:r>
+    </w:p>
+    <w:p>
+      <w:pPr>
+        <w:pStyle w:val="ListBullet"/>
+        <w:spacing w:before="0" w:after="0" w:line="283" w:lineRule="auto"/>
+      </w:pPr>
+      <w:r>
+        <w:rPr>
+          <w:rFonts w:ascii="Times New Roman" w:hAnsi="Times New Roman" w:eastAsia="Times New Roman"/>
+          <w:b w:val="0"/>
+          <w:i w:val="0"/>
+          <w:color w:val="2E3D50"/>
+          <w:sz w:val="20"/>
+        </w:rPr>
+        <w:t>Calculateur de crédit et pré-accord bancaire, échéances et intérêts.</w:t>
       </w:r>
     </w:p>
     <w:p>

</xml_diff>

<commit_message>
Use regular weight for public project titles
Keep the blue live links, but drop bold so project names match
body weight instead of job titles.

Co-authored-by: JellYouness <JellYouness@users.noreply.github.com>
</commit_message>
<xml_diff>
--- a/resume/output/Youness-Jellouli.docx
+++ b/resume/output/Youness-Jellouli.docx
@@ -989,7 +989,6 @@
             <w:sz w:val="22"/>
             <w:szCs w:val="22"/>
             <w:rFonts w:ascii="Times New Roman" w:hAnsi="Times New Roman"/>
-            <w:b/>
           </w:rPr>
           <w:t xml:space="preserve">AppartAli</w:t>
         </w:r>
@@ -1033,7 +1032,6 @@
             <w:sz w:val="22"/>
             <w:szCs w:val="22"/>
             <w:rFonts w:ascii="Times New Roman" w:hAnsi="Times New Roman"/>
-            <w:b/>
           </w:rPr>
           <w:t xml:space="preserve">AVSM Club</w:t>
         </w:r>
@@ -1077,7 +1075,6 @@
             <w:sz w:val="22"/>
             <w:szCs w:val="22"/>
             <w:rFonts w:ascii="Times New Roman" w:hAnsi="Times New Roman"/>
-            <w:b/>
           </w:rPr>
           <w:t xml:space="preserve">Invoicr</w:t>
         </w:r>
@@ -1121,7 +1118,6 @@
             <w:sz w:val="22"/>
             <w:szCs w:val="22"/>
             <w:rFonts w:ascii="Times New Roman" w:hAnsi="Times New Roman"/>
-            <w:b/>
           </w:rPr>
           <w:t xml:space="preserve">IBC</w:t>
         </w:r>
@@ -1165,7 +1161,6 @@
             <w:sz w:val="22"/>
             <w:szCs w:val="22"/>
             <w:rFonts w:ascii="Times New Roman" w:hAnsi="Times New Roman"/>
-            <w:b/>
           </w:rPr>
           <w:t xml:space="preserve">Wifina</w:t>
         </w:r>

</xml_diff>